<commit_message>
Dịch toàn bộ gói sang tiếng Việt
- README.md · translated
- index.html (dashboard) · already in Vietnamese
- deliverables/Jen-Tuan-Chau-Hero-Villa-Concept.docx · regenerated in Vietnamese
- deliverables/Jen-Tuan-Chau-Hero-Villa-Visualization.html · translated (SVG text + prose)
- deliverables/Jen-Tuan-Chau-Hero-Villa-Render-Prompts.md · wrapper translated; prompt blocks kept in English for image models
</commit_message>
<xml_diff>
--- a/deliverables/Jen-Tuan-Chau-Hero-Villa-Concept.docx
+++ b/deliverables/Jen-Tuan-Chau-Hero-Villa-Concept.docx
@@ -24,7 +24,7 @@
           <w:sz w:val="22"/>
           <w:szCs w:val="22"/>
         </w:rPr>
-        <w:t xml:space="preserve">CONCEPT DESIGN · VOLUME 01</w:t>
+        <w:t xml:space="preserve">THIẾT KẾ KHÁI NIỆM · TẬP 01</w:t>
       </w:r>
     </w:p>
     <w:p>
@@ -52,7 +52,7 @@
           <w:sz w:val="56"/>
           <w:szCs w:val="56"/>
         </w:rPr>
-        <w:t xml:space="preserve">JEN TUAN CHAU · HERO VILLA CONCEPT</w:t>
+        <w:t xml:space="preserve">JEN TUAN CHAU · BIỆT THỰ CHỦ ĐẠO</w:t>
       </w:r>
     </w:p>
     <w:p>
@@ -69,7 +69,7 @@
           <w:sz w:val="26"/>
           <w:szCs w:val="26"/>
         </w:rPr>
-        <w:t xml:space="preserve">Single Manor Residence — Caye Sereno, Khu Biệt Thự Lâm Ngọc, Tuần Châu, Hạ Long</w:t>
+        <w:t xml:space="preserve">Biệt Thự Lẻ — Caye Sereno, Khu Biệt Thự Lâm Ngọc, Tuần Châu, Hạ Long</w:t>
       </w:r>
     </w:p>
     <w:p>
@@ -104,7 +104,7 @@
           <w:sz w:val="22"/>
           <w:szCs w:val="22"/>
         </w:rPr>
-        <w:t xml:space="preserve">A colonial-tropical peer to Capella Sentosa Manors,</w:t>
+        <w:t xml:space="preserve">Đối tác thuộc cấp độ Capella Sentosa Manors,</w:t>
       </w:r>
     </w:p>
     <w:p>
@@ -121,7 +121,7 @@
           <w:sz w:val="22"/>
           <w:szCs w:val="22"/>
         </w:rPr>
-        <w:t xml:space="preserve">set into the existing Caye Sereno SEA Type 2 plan with L1 extended to match the ground-floor footprint.</w:t>
+        <w:t xml:space="preserve">được đặt vào kế hoạch Caye Sereno SEA Type 2 hiện có với Tầng 1 mở rộng để phù hợp với footprint tầng trệt.</w:t>
       </w:r>
     </w:p>
     <w:p>
@@ -143,7 +143,7 @@
           <w:sz w:val="20"/>
           <w:szCs w:val="20"/>
         </w:rPr>
-        <w:t xml:space="preserve">Prepared for  ·  Công ty TNHH Jen Tuan Chau</w:t>
+        <w:t xml:space="preserve">Chuẩn bị cho  ·  Công ty TNHH Jen Tuan Chau</w:t>
       </w:r>
     </w:p>
     <w:p>
@@ -157,7 +157,7 @@
           <w:sz w:val="20"/>
           <w:szCs w:val="20"/>
         </w:rPr>
-        <w:t xml:space="preserve">Base drawings  ·  Transform Architecture, Caye Sereno SEA Type 2 (06/2015)</w:t>
+        <w:t xml:space="preserve">Bản vẽ cơ sở  ·  Transform Architecture, Caye Sereno SEA Type 2 (06/2015)</w:t>
       </w:r>
     </w:p>
     <w:p>
@@ -171,7 +171,7 @@
           <w:sz w:val="20"/>
           <w:szCs w:val="20"/>
         </w:rPr>
-        <w:t xml:space="preserve">Reference  ·  Capella Singapore — Sentosa Manors (Foster + Partners / Matthew Shang)</w:t>
+        <w:t xml:space="preserve">Tham chiếu  ·  Capella Singapore — Sentosa Manors (Foster + Partners / Matthew Shang)</w:t>
       </w:r>
     </w:p>
     <w:p>
@@ -186,7 +186,7 @@
           <w:sz w:val="20"/>
           <w:szCs w:val="20"/>
         </w:rPr>
-        <w:t xml:space="preserve">Constraint source  ·  Báo cáo thẩm định Jen Tuan Chau (2025)</w:t>
+        <w:t xml:space="preserve">Nguồn ràng buộc  ·  Báo cáo thẩm định Jen Tuan Chau (2025)</w:t>
       </w:r>
     </w:p>
     <w:p>
@@ -202,7 +202,7 @@
           <w:sz w:val="20"/>
           <w:szCs w:val="20"/>
         </w:rPr>
-        <w:t xml:space="preserve">April 2026 · Issue for Client Review</w:t>
+        <w:t xml:space="preserve">Tháng Tư 2026 · Phát hành để Khách hàng duyệt</w:t>
       </w:r>
     </w:p>
     <w:p>
@@ -224,7 +224,7 @@
           <w:sz w:val="36"/>
           <w:szCs w:val="36"/>
         </w:rPr>
-        <w:t xml:space="preserve">01 · Executive Summary</w:t>
+        <w:t xml:space="preserve">01 · Tóm tắt điều hành</w:t>
       </w:r>
     </w:p>
     <w:p>
@@ -254,7 +254,7 @@
           <w:sz w:val="22"/>
           <w:szCs w:val="22"/>
         </w:rPr>
-        <w:t xml:space="preserve">This document sets out the concept design for a single hero manor villa on the Jen Tuan Chau estate (Khu Biệt Thự Lâm Ngọc, Tuần Châu island, Hạ Long Bay). The design is positioned as a peer to the Capella Sentosa Manors in Singapore — a low-rise, bay-facing, colonial-tropical residence that sits inside a UNESCO World Heritage buffer zone without competing with it.</w:t>
+        <w:t xml:space="preserve">Tài liệu này trình bày thiết kế khái niệm cho một biệt thự chủ đạo lẻ trên khu đất Jen Tuan Chau (Khu Biệt Thự Lâm Ngọc, đảo Tuần Châu, Vịnh Hạ Long). Thiết kế được định vị như một đối tác với Capella Sentosa Manors ở Singapore — một biệt thự hướng ra vịnh, kiến trúc thuộc địa-nhiệt đới, nằm bên trong vùng đệm UNESCO không tranh chấp với nó.</w:t>
       </w:r>
     </w:p>
     <w:p>
@@ -273,7 +273,7 @@
           <w:sz w:val="22"/>
           <w:szCs w:val="22"/>
         </w:rPr>
-        <w:t xml:space="preserve">The brief is threefold: (1) retain the plan and setting-out of the existing Caye Sereno SEA Type 2 villa prepared by Transform Architecture in June 2015 so that approvals, setbacks and the 1/500 master plan carry through unchanged; (2) extend the first floor (L1) to match the full ground-floor footprint so that usable GFA is maximised under the approved envelope; (3) replace the contemporary modernist language of the as-built drawings with a colonial-tropical language — pitched terracotta roof, rendered walls, deep verandas, dark timber shutters — that is directly readable as a Capella peer.</w:t>
+        <w:t xml:space="preserve">Bản tóm tắt có ba phần: (1) giữ nguyên mặt bằng và bố trí của biệt thự Caye Sereno SEA Type 2 hiện có được chuẩn bị bởi Transform Architecture vào tháng 6 năm 2015 để thủ tục phê duyệt, khoảng lùi và bản vẽ chính 1/500 không thay đổi; (2) mở rộng tầng một (L1) để phù hợp với toàn bộ footprint tầng trệt để tối đa hóa diện tích sàn sử dụng (GFA) trong phong bì đã được phê duyệt; (3) thay thế ngôn ngữ hiện đại đương đại của các bản vẽ hoàn công bằng ngôn ngữ thuộc địa-nhiệt đới — mái ngói đất nung màu đỏ đất, tường sơn vôi, hành lang có mái sâu, cửa chớp gỗ teak đen — có thể đọc được trực tiếp như một đối tác Capella.</w:t>
       </w:r>
     </w:p>
     <w:p>
@@ -290,7 +290,7 @@
           <w:sz w:val="22"/>
           <w:szCs w:val="22"/>
         </w:rPr>
-        <w:t xml:space="preserve">Headline numbers</w:t>
+        <w:t xml:space="preserve">Các con số chính</w:t>
       </w:r>
     </w:p>
     <w:tbl>
@@ -337,7 +337,7 @@
                 <w:sz w:val="20"/>
                 <w:szCs w:val="20"/>
               </w:rPr>
-              <w:t xml:space="preserve">Metric</w:t>
+              <w:t xml:space="preserve">Chỉ tiêu</w:t>
             </w:r>
           </w:p>
         </w:tc>
@@ -366,7 +366,7 @@
                 <w:sz w:val="20"/>
                 <w:szCs w:val="20"/>
               </w:rPr>
-              <w:t xml:space="preserve">Existing (Caye Sereno SEA Type 2)</w:t>
+              <w:t xml:space="preserve">Hiện có (Caye Sereno SEA Type 2)</w:t>
             </w:r>
           </w:p>
         </w:tc>
@@ -395,7 +395,7 @@
                 <w:sz w:val="20"/>
                 <w:szCs w:val="20"/>
               </w:rPr>
-              <w:t xml:space="preserve">Proposed (Hero Villa)</w:t>
+              <w:t xml:space="preserve">Đề xuất (Biệt thự chủ đạo)</w:t>
             </w:r>
           </w:p>
         </w:tc>
@@ -454,7 +454,7 @@
                 <w:sz w:val="20"/>
                 <w:szCs w:val="20"/>
               </w:rPr>
-              <w:t xml:space="preserve">Plot area</w:t>
+              <w:t xml:space="preserve">Diện tích khu đất</w:t>
             </w:r>
           </w:p>
         </w:tc>
@@ -482,7 +482,7 @@
                 <w:sz w:val="20"/>
                 <w:szCs w:val="20"/>
               </w:rPr>
-              <w:t xml:space="preserve">~840 m² (28.05 × 30.00 m)</w:t>
+              <w:t xml:space="preserve">~840 m² (28,05 × 30,00 m)</w:t>
             </w:r>
           </w:p>
         </w:tc>
@@ -510,7 +510,7 @@
                 <w:sz w:val="20"/>
                 <w:szCs w:val="20"/>
               </w:rPr>
-              <w:t xml:space="preserve">~840 m² (unchanged)</w:t>
+              <w:t xml:space="preserve">~840 m² (không thay đổi)</w:t>
             </w:r>
           </w:p>
         </w:tc>
@@ -569,7 +569,7 @@
                 <w:sz w:val="20"/>
                 <w:szCs w:val="20"/>
               </w:rPr>
-              <w:t xml:space="preserve">GF enclosed area</w:t>
+              <w:t xml:space="preserve">Diện tích tầng trệt</w:t>
             </w:r>
           </w:p>
         </w:tc>
@@ -686,7 +686,7 @@
                 <w:sz w:val="20"/>
                 <w:szCs w:val="20"/>
               </w:rPr>
-              <w:t xml:space="preserve">L1 enclosed area</w:t>
+              <w:t xml:space="preserve">Diện tích tầng 1</w:t>
             </w:r>
           </w:p>
         </w:tc>
@@ -714,7 +714,7 @@
                 <w:sz w:val="20"/>
                 <w:szCs w:val="20"/>
               </w:rPr>
-              <w:t xml:space="preserve">~152 m² (partial)</w:t>
+              <w:t xml:space="preserve">~152 m² (một phần)</w:t>
             </w:r>
           </w:p>
         </w:tc>
@@ -801,7 +801,7 @@
                 <w:sz w:val="20"/>
                 <w:szCs w:val="20"/>
               </w:rPr>
-              <w:t xml:space="preserve">Total GFA</w:t>
+              <w:t xml:space="preserve">Tổng GFA</w:t>
             </w:r>
           </w:p>
         </w:tc>
@@ -918,7 +918,7 @@
                 <w:sz w:val="20"/>
                 <w:szCs w:val="20"/>
               </w:rPr>
-              <w:t xml:space="preserve">Ridge height</w:t>
+              <w:t xml:space="preserve">Chiều cao đỉnh mái</w:t>
             </w:r>
           </w:p>
         </w:tc>
@@ -946,7 +946,7 @@
                 <w:sz w:val="20"/>
                 <w:szCs w:val="20"/>
               </w:rPr>
-              <w:t xml:space="preserve">~7.00 m (flat roof +6.97)</w:t>
+              <w:t xml:space="preserve">~7,00 m (mái bằng +6,97)</w:t>
             </w:r>
           </w:p>
         </w:tc>
@@ -974,7 +974,7 @@
                 <w:sz w:val="20"/>
                 <w:szCs w:val="20"/>
               </w:rPr>
-              <w:t xml:space="preserve">≤9.00 m (pitched, compliant)</w:t>
+              <w:t xml:space="preserve">≤9,00 m (mái heng, tuân thủ)</w:t>
             </w:r>
           </w:p>
         </w:tc>
@@ -1002,7 +1002,7 @@
                 <w:sz w:val="20"/>
                 <w:szCs w:val="20"/>
               </w:rPr>
-              <w:t xml:space="preserve">within envelope</w:t>
+              <w:t xml:space="preserve">trong phong bì</w:t>
             </w:r>
           </w:p>
         </w:tc>
@@ -1033,7 +1033,7 @@
                 <w:sz w:val="20"/>
                 <w:szCs w:val="20"/>
               </w:rPr>
-              <w:t xml:space="preserve">Bedrooms</w:t>
+              <w:t xml:space="preserve">Phòng ngủ</w:t>
             </w:r>
           </w:p>
         </w:tc>
@@ -1062,7 +1062,7 @@
                 <w:sz w:val="20"/>
                 <w:szCs w:val="20"/>
               </w:rPr>
-              <w:t xml:space="preserve">4 suites</w:t>
+              <w:t xml:space="preserve">4 phòng</w:t>
             </w:r>
           </w:p>
         </w:tc>
@@ -1091,7 +1091,7 @@
                 <w:sz w:val="20"/>
                 <w:szCs w:val="20"/>
               </w:rPr>
-              <w:t xml:space="preserve">4 suites + study + staff</w:t>
+              <w:t xml:space="preserve">4 phòng + phòng học + phòng hầu</w:t>
             </w:r>
           </w:p>
         </w:tc>
@@ -1120,7 +1120,7 @@
                 <w:sz w:val="20"/>
                 <w:szCs w:val="20"/>
               </w:rPr>
-              <w:t xml:space="preserve">program upgrade</w:t>
+              <w:t xml:space="preserve">nâng cấp chương trình</w:t>
             </w:r>
           </w:p>
         </w:tc>
@@ -1150,7 +1150,7 @@
                 <w:sz w:val="20"/>
                 <w:szCs w:val="20"/>
               </w:rPr>
-              <w:t xml:space="preserve">Style</w:t>
+              <w:t xml:space="preserve">Phong cách</w:t>
             </w:r>
           </w:p>
         </w:tc>
@@ -1178,7 +1178,7 @@
                 <w:sz w:val="20"/>
                 <w:szCs w:val="20"/>
               </w:rPr>
-              <w:t xml:space="preserve">Contemporary modernist</w:t>
+              <w:t xml:space="preserve">Hiện đại đương đại</w:t>
             </w:r>
           </w:p>
         </w:tc>
@@ -1206,7 +1206,7 @@
                 <w:sz w:val="20"/>
                 <w:szCs w:val="20"/>
               </w:rPr>
-              <w:t xml:space="preserve">Colonial-tropical (Capella peer)</w:t>
+              <w:t xml:space="preserve">Thuộc địa-nhiệt đới (đối tác Capella)</w:t>
             </w:r>
           </w:p>
         </w:tc>
@@ -1234,7 +1234,7 @@
                 <w:sz w:val="20"/>
                 <w:szCs w:val="20"/>
               </w:rPr>
-              <w:t xml:space="preserve">re-clad</w:t>
+              <w:t xml:space="preserve">lót lại</w:t>
             </w:r>
           </w:p>
         </w:tc>
@@ -1264,7 +1264,7 @@
           <w:sz w:val="22"/>
           <w:szCs w:val="22"/>
         </w:rPr>
-        <w:t xml:space="preserve">Against the Capella Sentosa Manor benchmark of 434–436 m², the proposed villa is ~38% larger. This is the direct effect of the user-confirmed decision “Full match — L1 = GF footprint”, and satisfies the brief to build to the maximum area permitted by the approved 1/500 envelope.</w:t>
+        <w:t xml:space="preserve">So với tiêu chuẩn Capella Sentosa Manor 434–436 m², biệt thự đề xuất lớn hơn khoảng 38%. Đây là kết quả trực tiếp của quyết định đã được xác nhận của người dùng 'Full match — L1 = GF footprint', và thỏa mãn bản tóm tắt để xây dựng đến diện tích tối đa được cho phép bởi phong bì 1/500 đã được phê duyệt.</w:t>
       </w:r>
     </w:p>
     <w:p>
@@ -1286,7 +1286,7 @@
           <w:sz w:val="36"/>
           <w:szCs w:val="36"/>
         </w:rPr>
-        <w:t xml:space="preserve">02 · Site, Approvals and Constraints</w:t>
+        <w:t xml:space="preserve">02 · Khu đất, Thủ tục phê duyệt và Ràng buộc</w:t>
       </w:r>
     </w:p>
     <w:p>
@@ -1316,7 +1316,7 @@
           <w:sz w:val="22"/>
           <w:szCs w:val="22"/>
         </w:rPr>
-        <w:t xml:space="preserve">The site sits on the eastern tip of Tuần Châu island, on plots covered by Land Use Right Certificates Bi 462036 (7,774 m²) and Bi 462037 (8,054 m²) — a combined 15,828 m² forming the Lâm Ngọc villa zone. The approved sub-division (Quyết định 1112/2012, master plan 1/500) contemplates eighteen ultra-premium villa plots arranged along the southern (bay-facing) edge, with service access from the north.</w:t>
+        <w:t xml:space="preserve">Khu đất nằm trên mũi phía đông của đảo Tuần Châu, trên các thửa đất được bảo hiểm bởi Giấy chứng nhận Quyền sử dụng đất Bi 462036 (7.774 m²) và Bi 462037 (8.054 m²) — tổng cộng 15.828 m² tạo thành khu biệt thự Lâm Ngọc. Phân chia được phê duyệt (Quyết định 1112/2012, bản vẽ chính 1/500) dự kiến mười tám thửa đất biệt thự siêu cao cấp sắp xếp dọc theo cạnh phía nam (hướng ra vịnh), với tiếp cận dịch vụ từ phía bắc.</w:t>
       </w:r>
     </w:p>
     <w:p>
@@ -1333,7 +1333,7 @@
           <w:sz w:val="28"/>
           <w:szCs w:val="28"/>
         </w:rPr>
-        <w:t xml:space="preserve">2.1 Statutory envelope</w:t>
+        <w:t xml:space="preserve">2.1 Phong bì pháp định</w:t>
       </w:r>
     </w:p>
     <w:tbl>
@@ -1379,7 +1379,7 @@
                 <w:sz w:val="20"/>
                 <w:szCs w:val="20"/>
               </w:rPr>
-              <w:t xml:space="preserve">Approval / Constraint</w:t>
+              <w:t xml:space="preserve">Thủ tục phê duyệt / Ràng buộc</w:t>
             </w:r>
           </w:p>
         </w:tc>
@@ -1408,7 +1408,7 @@
                 <w:sz w:val="20"/>
                 <w:szCs w:val="20"/>
               </w:rPr>
-              <w:t xml:space="preserve">Reference</w:t>
+              <w:t xml:space="preserve">Căn cứ</w:t>
             </w:r>
           </w:p>
         </w:tc>
@@ -1437,7 +1437,7 @@
                 <w:sz w:val="20"/>
                 <w:szCs w:val="20"/>
               </w:rPr>
-              <w:t xml:space="preserve">Effect on design</w:t>
+              <w:t xml:space="preserve">Tác động đến thiết kế</w:t>
             </w:r>
           </w:p>
         </w:tc>
@@ -1467,7 +1467,7 @@
                 <w:sz w:val="20"/>
                 <w:szCs w:val="20"/>
               </w:rPr>
-              <w:t xml:space="preserve">1/500 Master Plan — Lâm Ngọc</w:t>
+              <w:t xml:space="preserve">Bản vẽ chính 1/500 — Lâm Ngọc</w:t>
             </w:r>
           </w:p>
         </w:tc>
@@ -1523,7 +1523,7 @@
                 <w:sz w:val="20"/>
                 <w:szCs w:val="20"/>
               </w:rPr>
-              <w:t xml:space="preserve">Fixes plot, setbacks, 2–3 floor ceiling</w:t>
+              <w:t xml:space="preserve">Cố định thửa đất, khoảng lùi, trần 2–3 tầng</w:t>
             </w:r>
           </w:p>
         </w:tc>
@@ -1554,7 +1554,7 @@
                 <w:sz w:val="20"/>
                 <w:szCs w:val="20"/>
               </w:rPr>
-              <w:t xml:space="preserve">1/2000 Master Plan — Cảng Ngọc Châu</w:t>
+              <w:t xml:space="preserve">Bản vẽ chính 1/2000 — Cảng Ngọc Châu</w:t>
             </w:r>
           </w:p>
         </w:tc>
@@ -1612,7 +1612,7 @@
                 <w:sz w:val="20"/>
                 <w:szCs w:val="20"/>
               </w:rPr>
-              <w:t xml:space="preserve">Context / road alignment</w:t>
+              <w:t xml:space="preserve">Bối cảnh / căn chỉnh đường</w:t>
             </w:r>
           </w:p>
         </w:tc>
@@ -1642,7 +1642,7 @@
                 <w:sz w:val="20"/>
                 <w:szCs w:val="20"/>
               </w:rPr>
-              <w:t xml:space="preserve">Investment Certificate (5th revision)</w:t>
+              <w:t xml:space="preserve">Giấy chứng nhận đầu tư (sửa đổi lần thứ 5)</w:t>
             </w:r>
           </w:p>
         </w:tc>
@@ -1698,7 +1698,7 @@
                 <w:sz w:val="20"/>
                 <w:szCs w:val="20"/>
               </w:rPr>
-              <w:t xml:space="preserve">Project remains live; no expiry concern</w:t>
+              <w:t xml:space="preserve">Dự án vẫn hiệu lực; không lo lắng về hết hạn</w:t>
             </w:r>
           </w:p>
         </w:tc>
@@ -1729,7 +1729,7 @@
                 <w:sz w:val="20"/>
                 <w:szCs w:val="20"/>
               </w:rPr>
-              <w:t xml:space="preserve">Business classification</w:t>
+              <w:t xml:space="preserve">Phân loại kinh doanh</w:t>
             </w:r>
           </w:p>
         </w:tc>
@@ -1787,7 +1787,7 @@
                 <w:sz w:val="20"/>
                 <w:szCs w:val="20"/>
               </w:rPr>
-              <w:t xml:space="preserve">≤3 floors residential/tourist lodging</w:t>
+              <w:t xml:space="preserve">≤3 tầng nhà ở/lưu trú du lịch</w:t>
             </w:r>
           </w:p>
         </w:tc>
@@ -1817,7 +1817,7 @@
                 <w:sz w:val="20"/>
                 <w:szCs w:val="20"/>
               </w:rPr>
-              <w:t xml:space="preserve">UNESCO Ha Long Bay buffer</w:t>
+              <w:t xml:space="preserve">Vùng đệm UNESCO Hạ Long</w:t>
             </w:r>
           </w:p>
         </w:tc>
@@ -1845,7 +1845,7 @@
                 <w:sz w:val="20"/>
                 <w:szCs w:val="20"/>
               </w:rPr>
-              <w:t xml:space="preserve">306 km² buffer zone</w:t>
+              <w:t xml:space="preserve">Vùng đệm 306 km²</w:t>
             </w:r>
           </w:p>
         </w:tc>
@@ -1873,7 +1873,7 @@
                 <w:sz w:val="20"/>
                 <w:szCs w:val="20"/>
               </w:rPr>
-              <w:t xml:space="preserve">Low rise, muted colour, no reflective finishes</w:t>
+              <w:t xml:space="preserve">Thấp, màu sắc nhẹ, không lớp phủ phản xạ</w:t>
             </w:r>
           </w:p>
         </w:tc>
@@ -1904,7 +1904,7 @@
                 <w:sz w:val="20"/>
                 <w:szCs w:val="20"/>
               </w:rPr>
-              <w:t xml:space="preserve">Environmental commitment</w:t>
+              <w:t xml:space="preserve">Cam kết môi trường</w:t>
             </w:r>
           </w:p>
         </w:tc>
@@ -1933,7 +1933,7 @@
                 <w:sz w:val="20"/>
                 <w:szCs w:val="20"/>
               </w:rPr>
-              <w:t xml:space="preserve">§14 — DTM/CKBVMT accepted</w:t>
+              <w:t xml:space="preserve">§14 — DTM/CKBVMT được chấp nhận</w:t>
             </w:r>
           </w:p>
         </w:tc>
@@ -1962,7 +1962,7 @@
                 <w:sz w:val="20"/>
                 <w:szCs w:val="20"/>
               </w:rPr>
-              <w:t xml:space="preserve">No further EIA trigger at villa scale</w:t>
+              <w:t xml:space="preserve">Không kích hoạt EIA nữa ở quy mô biệt thự</w:t>
             </w:r>
           </w:p>
         </w:tc>
@@ -1992,7 +1992,7 @@
                 <w:sz w:val="20"/>
                 <w:szCs w:val="20"/>
               </w:rPr>
-              <w:t xml:space="preserve">Building permit</w:t>
+              <w:t xml:space="preserve">Giấy phép xây dựng</w:t>
             </w:r>
           </w:p>
         </w:tc>
@@ -2020,7 +2020,7 @@
                 <w:sz w:val="20"/>
                 <w:szCs w:val="20"/>
               </w:rPr>
-              <w:t xml:space="preserve">§13 — exempt (approved 1/500)</w:t>
+              <w:t xml:space="preserve">§13 — miễn (phê duyệt 1/500)</w:t>
             </w:r>
           </w:p>
         </w:tc>
@@ -2048,7 +2048,7 @@
                 <w:sz w:val="20"/>
                 <w:szCs w:val="20"/>
               </w:rPr>
-              <w:t xml:space="preserve">No GPXD required; construction notice only</w:t>
+              <w:t xml:space="preserve">Không cần GPXD; chỉ cần thông báo xây dựng</w:t>
             </w:r>
           </w:p>
         </w:tc>
@@ -2076,7 +2076,7 @@
           <w:sz w:val="28"/>
           <w:szCs w:val="28"/>
         </w:rPr>
-        <w:t xml:space="preserve">2.2 Risk register carried forward from the appraisal</w:t>
+        <w:t xml:space="preserve">2.2 Danh mục rủi ro được thực hiện từ báo cáo thẩm định</w:t>
       </w:r>
     </w:p>
     <w:p>
@@ -2095,7 +2095,7 @@
           <w:sz w:val="22"/>
           <w:szCs w:val="22"/>
         </w:rPr>
-        <w:t xml:space="preserve">The Jen Tuan Chau due-diligence appraisal (báo cáo thẩm định, 2025) scores the project MEDIUM-HIGH RISK on a 1R+3Y+2G traffic-light basis. The design must not worsen any of those flags:</w:t>
+        <w:t xml:space="preserve">Báo cáo thẩm định do diligence của Jen Tuan Chau (báo cáo thẩm định, 2025) xếp loại dự án RỦI RO TRUNG BÌNH-CAO trên cơ sở 1R+3Y+2G. Thiết kế không được làm xấu đi bất kỳ cờ nào:</w:t>
       </w:r>
     </w:p>
     <w:p>
@@ -2118,7 +2118,7 @@
           <w:sz w:val="22"/>
           <w:szCs w:val="22"/>
         </w:rPr>
-        <w:t xml:space="preserve">UNESCO buffer zone </w:t>
+        <w:t xml:space="preserve">Vùng đệm UNESCO </w:t>
       </w:r>
       <w:r>
         <w:rPr>
@@ -2131,7 +2131,7 @@
           <w:sz w:val="22"/>
           <w:szCs w:val="22"/>
         </w:rPr>
-        <w:t xml:space="preserve">(🔴 red) — retain low ridge (≤9 m), muted palette, terracotta roof matched to Capella's copper heritage so the villa reads as landscape, not skyline.</w:t>
+        <w:t xml:space="preserve">(🔴 đỏ) — giữ đỉnh mái thấp (≤9 m), bảng màu nhẹ, mái ngói đất nung phù hợp với di sản đồng màu của Capella để biệt thự đọc là cảnh quan, không là đường chân trời.</w:t>
       </w:r>
     </w:p>
     <w:p>
@@ -2154,7 +2154,7 @@
           <w:sz w:val="22"/>
           <w:szCs w:val="22"/>
         </w:rPr>
-        <w:t xml:space="preserve">Land-use fees &amp; CCC </w:t>
+        <w:t xml:space="preserve">Lệ phí sử dụng đất &amp; CCC </w:t>
       </w:r>
       <w:r>
         <w:rPr>
@@ -2167,7 +2167,7 @@
           <w:sz w:val="22"/>
           <w:szCs w:val="22"/>
         </w:rPr>
-        <w:t xml:space="preserve">(🟡 yellow) — design keeps GFA inside the approved 1/500 envelope; no rezoning needed.</w:t>
+        <w:t xml:space="preserve">(🟡 vàng) — thiết kế giữ GFA bên trong phong bì 1/500 đã được phê duyệt; không cần phân vùng lại.</w:t>
       </w:r>
     </w:p>
     <w:p>
@@ -2190,7 +2190,7 @@
           <w:sz w:val="22"/>
           <w:szCs w:val="22"/>
         </w:rPr>
-        <w:t xml:space="preserve">JVA governance </w:t>
+        <w:t xml:space="preserve">Quản trị JVA </w:t>
       </w:r>
       <w:r>
         <w:rPr>
@@ -2203,7 +2203,7 @@
           <w:sz w:val="22"/>
           <w:szCs w:val="22"/>
         </w:rPr>
-        <w:t xml:space="preserve">(🟡 yellow) — deliverable is style-neutral to the Jen Cap × Đào Ngọc split; can be built by either party.</w:t>
+        <w:t xml:space="preserve">(🟡 vàng) — sản phẩm bàn giao là trung lập về phong cách đối với phân tách Jen Cap × Đào Ngọc; có thể được xây dựng bởi bất kỳ bên nào.</w:t>
       </w:r>
     </w:p>
     <w:p>
@@ -2226,7 +2226,7 @@
           <w:sz w:val="22"/>
           <w:szCs w:val="22"/>
         </w:rPr>
-        <w:t xml:space="preserve">Construction history </w:t>
+        <w:t xml:space="preserve">Lịch sử xây dựng </w:t>
       </w:r>
       <w:r>
         <w:rPr>
@@ -2239,7 +2239,7 @@
           <w:sz w:val="22"/>
           <w:szCs w:val="22"/>
         </w:rPr>
-        <w:t xml:space="preserve">(🟡 yellow) — PHG completion dated 19-06-2015; new works treated as refurbishment + L1 extension, not fresh ground-up.</w:t>
+        <w:t xml:space="preserve">(🟡 vàng) — hoàn công PHG ngày 19-06-2015; công trình mới được coi là tu sửa + mở rộng L1, không phải xây dựng từ đầu.</w:t>
       </w:r>
     </w:p>
     <w:p>
@@ -2262,7 +2262,7 @@
           <w:sz w:val="22"/>
           <w:szCs w:val="22"/>
         </w:rPr>
-        <w:t xml:space="preserve">LURC clarity </w:t>
+        <w:t xml:space="preserve">Rõ ràng LURC </w:t>
       </w:r>
       <w:r>
         <w:rPr>
@@ -2275,7 +2275,7 @@
           <w:sz w:val="22"/>
           <w:szCs w:val="22"/>
         </w:rPr>
-        <w:t xml:space="preserve">(🟢 green) — Bi 462036 + Bi 462037 preserved.</w:t>
+        <w:t xml:space="preserve">(🟢 xanh) — Bi 462036 + Bi 462037 được bảo tồn.</w:t>
       </w:r>
     </w:p>
     <w:p>
@@ -2298,7 +2298,7 @@
           <w:sz w:val="22"/>
           <w:szCs w:val="22"/>
         </w:rPr>
-        <w:t xml:space="preserve">Financial records </w:t>
+        <w:t xml:space="preserve">Hồ sơ tài chính </w:t>
       </w:r>
       <w:r>
         <w:rPr>
@@ -2311,7 +2311,7 @@
           <w:sz w:val="22"/>
           <w:szCs w:val="22"/>
         </w:rPr>
-        <w:t xml:space="preserve">(🟢 green) — six years of audited FS support the capex case.</w:t>
+        <w:t xml:space="preserve">(🟢 xanh) — sáu năm hồ sơ tài chính đã kiểm toán hỗ trợ trường hợp capex.</w:t>
       </w:r>
     </w:p>
     <w:p>
@@ -2333,7 +2333,7 @@
           <w:sz w:val="36"/>
           <w:szCs w:val="36"/>
         </w:rPr>
-        <w:t xml:space="preserve">03 · Precedent — Capella Sentosa Manors</w:t>
+        <w:t xml:space="preserve">03 · Tiền lệ — Capella Sentosa Manors</w:t>
       </w:r>
     </w:p>
     <w:p>
@@ -2363,7 +2363,7 @@
           <w:sz w:val="22"/>
           <w:szCs w:val="22"/>
         </w:rPr>
-        <w:t xml:space="preserve">Capella Singapore occupies two restored 1880s colonial “black-and-white bungalows” on Sentosa, wrapped by a new low-rise hotel wing designed by Foster + Partners (restoration completed 2009; interiors by Matthew Shang Design Office for the 2023 refresh). The three Sentosa Manors are three-bedroom, 434–436 m² private residences set inside the hotel's landscape, each with its own pool, garden and colonial-plantation architecture — deep overhanging pitched roofs, white-rendered walls, dark teak shutters, wraparound verandas, copper-to-terracotta roof tones, and an ivory/charcoal/brass interior palette punctuated by tropical planting.</w:t>
+        <w:t xml:space="preserve">Capella Singapore chiếm hai ngôi nhà thuộc địa được phục hồi năm 1880 'trắng-đen' trên Sentosa, được bao bọc bởi một cánh khách sạn thấp mới được thiết kế bởi Foster + Partners (phục hồi hoàn thành 2009; nội thất bởi Matthew Shang Design Office cho làm mới 2023). Ba Sentosa Manors là ba phòng ngủ, 434–436 m² biệt thự tư nhân được đặt bên trong cảnh quan của khách sạn, mỗi cái có hồ bơi riêng, vườn và kiến trúc thuộc địa đồn điền — mái heng quá hang sâu, tường sơn trắng, cửa chớp gỗ teak đen, hành lang có mái bao quanh, tông mài từ đồng sang đất nung, và bảng màu nội thất xám ốm/trắng/đồng được nhấn mạnh bởi cây trồng nhiệt đới.</w:t>
       </w:r>
     </w:p>
     <w:p>
@@ -2380,7 +2380,7 @@
           <w:sz w:val="28"/>
           <w:szCs w:val="28"/>
         </w:rPr>
-        <w:t xml:space="preserve">3.1 Design language transferred to Jen Tuan Chau</w:t>
+        <w:t xml:space="preserve">3.1 Ngôn ngữ thiết kế chuyển giao đến Jen Tuan Chau</w:t>
       </w:r>
     </w:p>
     <w:tbl>
@@ -2425,7 +2425,7 @@
                 <w:sz w:val="20"/>
                 <w:szCs w:val="20"/>
               </w:rPr>
-              <w:t xml:space="preserve">Capella Sentosa Manor attribute</w:t>
+              <w:t xml:space="preserve">Thuộc tính Capella Sentosa Manor</w:t>
             </w:r>
           </w:p>
         </w:tc>
@@ -2454,7 +2454,7 @@
                 <w:sz w:val="20"/>
                 <w:szCs w:val="20"/>
               </w:rPr>
-              <w:t xml:space="preserve">Application at Jen Tuan Chau</w:t>
+              <w:t xml:space="preserve">Ứng dụng tại Jen Tuan Chau</w:t>
             </w:r>
           </w:p>
         </w:tc>
@@ -2484,7 +2484,7 @@
                 <w:sz w:val="20"/>
                 <w:szCs w:val="20"/>
               </w:rPr>
-              <w:t xml:space="preserve">Low single/two-storey silhouette</w:t>
+              <w:t xml:space="preserve">Hình bóng một/hai tầng thấp</w:t>
             </w:r>
           </w:p>
         </w:tc>
@@ -2512,7 +2512,7 @@
                 <w:sz w:val="20"/>
                 <w:szCs w:val="20"/>
               </w:rPr>
-              <w:t xml:space="preserve">Retain ~7–9 m ridge; two storeys with pitched roof over flat-roof lines</w:t>
+              <w:t xml:space="preserve">Giữ đỉnh ~7–9 m; hai tầng với mái heng trên đường nét mái bằng</w:t>
             </w:r>
           </w:p>
         </w:tc>
@@ -2543,7 +2543,7 @@
                 <w:sz w:val="20"/>
                 <w:szCs w:val="20"/>
               </w:rPr>
-              <w:t xml:space="preserve">White-rendered walls, dark timber shutters</w:t>
+              <w:t xml:space="preserve">Tường sơn trắng, cửa chớp gỗ teak đen</w:t>
             </w:r>
           </w:p>
         </w:tc>
@@ -2572,7 +2572,7 @@
                 <w:sz w:val="20"/>
                 <w:szCs w:val="20"/>
               </w:rPr>
-              <w:t xml:space="preserve">Replace STW2 stone cladding on upper floors with lime-washed render; SDET-075 bamboo screens become teak louvered shutters</w:t>
+              <w:t xml:space="preserve">Thay thế lớp ốp đá STW2 trên tầng trên bằng sơn vôi trang trí; rèm tre SDET-075 trở thành cửa chớp lam teak</w:t>
             </w:r>
           </w:p>
         </w:tc>
@@ -2602,7 +2602,7 @@
                 <w:sz w:val="20"/>
                 <w:szCs w:val="20"/>
               </w:rPr>
-              <w:t xml:space="preserve">Copper / terracotta pitched roof</w:t>
+              <w:t xml:space="preserve">Mái ngói đồng / đất nung heng</w:t>
             </w:r>
           </w:p>
         </w:tc>
@@ -2630,7 +2630,7 @@
                 <w:sz w:val="20"/>
                 <w:szCs w:val="20"/>
               </w:rPr>
-              <w:t xml:space="preserve">Introduce pitched clay-tile roof over the existing ArAD flat-roof datum; copper gutter + ridge</w:t>
+              <w:t xml:space="preserve">Giới thiệu mái ngói đất nung heng trên mái bằng ArAD hiện có; rãnh đồng + đỉnh</w:t>
             </w:r>
           </w:p>
         </w:tc>
@@ -2661,7 +2661,7 @@
                 <w:sz w:val="20"/>
                 <w:szCs w:val="20"/>
               </w:rPr>
-              <w:t xml:space="preserve">Deep verandas wrapping bay elevations</w:t>
+              <w:t xml:space="preserve">Hành lang có mái sâu bao bọc hướng vịnh</w:t>
             </w:r>
           </w:p>
         </w:tc>
@@ -2690,7 +2690,7 @@
                 <w:sz w:val="20"/>
                 <w:szCs w:val="20"/>
               </w:rPr>
-              <w:t xml:space="preserve">2.4 m cantilever veranda along south and west elevations</w:t>
+              <w:t xml:space="preserve">Hành lang có mái quá hang 2,4 m dọc theo mặt đứng phía nam (hướng vịnh) và tây trên cả tầng trệt và tầng 1</w:t>
             </w:r>
           </w:p>
         </w:tc>
@@ -2720,7 +2720,7 @@
                 <w:sz w:val="20"/>
                 <w:szCs w:val="20"/>
               </w:rPr>
-              <w:t xml:space="preserve">Colonial symmetry around central foyer</w:t>
+              <w:t xml:space="preserve">Đối xứng thuộc địa quanh sảnh trung tâm</w:t>
             </w:r>
           </w:p>
         </w:tc>
@@ -2748,7 +2748,7 @@
                 <w:sz w:val="20"/>
                 <w:szCs w:val="20"/>
               </w:rPr>
-              <w:t xml:space="preserve">Keep existing gridline C as central axis; mirror plan around it</w:t>
+              <w:t xml:space="preserve">Giữ đường thẳng hiện có C là trục trung tâm; phản chiếu mặt bằng quanh nó</w:t>
             </w:r>
           </w:p>
         </w:tc>
@@ -2779,7 +2779,7 @@
                 <w:sz w:val="20"/>
                 <w:szCs w:val="20"/>
               </w:rPr>
-              <w:t xml:space="preserve">Neutral ivory/charcoal/brass interior</w:t>
+              <w:t xml:space="preserve">Bảng màu nội thất trung lập ốm/xám/đồng</w:t>
             </w:r>
           </w:p>
         </w:tc>
@@ -2808,7 +2808,7 @@
                 <w:sz w:val="20"/>
                 <w:szCs w:val="20"/>
               </w:rPr>
-              <w:t xml:space="preserve">Replace contemporary palette of the SEA Type 2 with lime-washed walls, teak joinery, aged brass, raffia textiles</w:t>
+              <w:t xml:space="preserve">Thay thế bảng màu đương đại của SEA Type 2 bằng tường sơn vôi thô ốm ấm, sàn ngói teak xương cá, bảng tấm raffia dệt, phần cứng đồng cũ, vải lanh bọc phong cách lúa mì và mực, các nghệ thuật và vải dệt có nguồn gốc từ truyền thống thủ công Hạ Long / Đông Hồ</w:t>
             </w:r>
           </w:p>
         </w:tc>
@@ -2838,7 +2838,7 @@
                 <w:sz w:val="20"/>
                 <w:szCs w:val="20"/>
               </w:rPr>
-              <w:t xml:space="preserve">Tropical botanical planting (frangipani, heliconia)</w:t>
+              <w:t xml:space="preserve">Cây trồng bộ xương rau quả (frangipani, heliconia)</w:t>
             </w:r>
           </w:p>
         </w:tc>
@@ -2866,7 +2866,7 @@
                 <w:sz w:val="20"/>
                 <w:szCs w:val="20"/>
               </w:rPr>
-              <w:t xml:space="preserve">Foreground planting on pool terrace; mature frangipani flanking entry court</w:t>
+              <w:t xml:space="preserve">Cây trồng tiền cảnh trên sân hồ bơi; frangipani trưởng thành ôm chặt sân vào</w:t>
             </w:r>
           </w:p>
         </w:tc>
@@ -2897,7 +2897,7 @@
                 <w:sz w:val="20"/>
                 <w:szCs w:val="20"/>
               </w:rPr>
-              <w:t xml:space="preserve">Private pool, outdoor sala, BBQ</w:t>
+              <w:t xml:space="preserve">Hồ bơi tư nhân, sân khấu ngoài trời, BBQ</w:t>
             </w:r>
           </w:p>
         </w:tc>
@@ -2926,7 +2926,7 @@
                 <w:sz w:val="20"/>
                 <w:szCs w:val="20"/>
               </w:rPr>
-              <w:t xml:space="preserve">Retain existing pool; add a sala pavilion on the east lawn</w:t>
+              <w:t xml:space="preserve">Giữ hồ bơi hiện có; thêm sân khấu phòng trên thảo nguyên phía đông</w:t>
             </w:r>
           </w:p>
         </w:tc>
@@ -2956,7 +2956,7 @@
           <w:sz w:val="22"/>
           <w:szCs w:val="22"/>
         </w:rPr>
-        <w:t xml:space="preserve">The goal is not pastiche. Capella's authority comes from the honesty of the bungalow plan — a thick central spine with verandas on both long sides, cross-ventilated rooms, tall ceilings and a roof that does the aesthetic work. The existing Caye Sereno plan already has the right bones (a linear main block with secondary service wing); re-cladding the skin and pitching the roof is enough to carry the reference convincingly.</w:t>
+        <w:t xml:space="preserve">Mục tiêu không phải là cầu kỳ. Quyền lực của Capella đến từ tính trung thực của kế hoạch phòng — một sống lưng trung tâm dày có hành lang trên cả hai cạnh dài, phòng thông gió chéo, trần cao và mái làm công việc th美学. Kế hoạch Caye Sereno hiện có đã có xương đúng (khối chính tuyến tính với cánh dịch vụ phụ); lót lại da và mái heng là đủ để mang tham chiếu thuyết phục.</w:t>
       </w:r>
     </w:p>
     <w:p>
@@ -2978,7 +2978,7 @@
           <w:sz w:val="36"/>
           <w:szCs w:val="36"/>
         </w:rPr>
-        <w:t xml:space="preserve">04 · Base Drawings — Caye Sereno SEA Type 2</w:t>
+        <w:t xml:space="preserve">04 · Bản vẽ cơ sở — Caye Sereno SEA Type 2</w:t>
       </w:r>
     </w:p>
     <w:p>
@@ -3008,7 +3008,7 @@
           <w:sz w:val="22"/>
           <w:szCs w:val="22"/>
         </w:rPr>
-        <w:t xml:space="preserve">The as-built package by Transform Architecture (sheet set ArAD, June 2015, executed by Phú Hưng Gia) provides the setting-out, structural grid and finishes library that the concept re-uses. Dimensions are preserved exactly; only the envelope, roof and L1 extent are modified.</w:t>
+        <w:t xml:space="preserve">Gói hoàn công bởi Transform Architecture (bộ tờ ArAD, tháng 6 năm 2015, thực hiện bởi Phú Hưng Gia) cung cấp bố trí, lưới cấu trúc và thư viện hoàn thiện mà khái niệm tái sử dụng. Kích thước được bảo tồn chính xác; chỉ phong bì, mái và mức L1 được sửa đổi.</w:t>
       </w:r>
     </w:p>
     <w:p>
@@ -3025,7 +3025,7 @@
           <w:sz w:val="28"/>
           <w:szCs w:val="28"/>
         </w:rPr>
-        <w:t xml:space="preserve">4.1 Dimensional inventory</w:t>
+        <w:t xml:space="preserve">4.1 Kho tàng kích thước</w:t>
       </w:r>
     </w:p>
     <w:tbl>
@@ -3071,7 +3071,7 @@
                 <w:sz w:val="20"/>
                 <w:szCs w:val="20"/>
               </w:rPr>
-              <w:t xml:space="preserve">Parameter</w:t>
+              <w:t xml:space="preserve">Tham số</w:t>
             </w:r>
           </w:p>
         </w:tc>
@@ -3100,7 +3100,7 @@
                 <w:sz w:val="20"/>
                 <w:szCs w:val="20"/>
               </w:rPr>
-              <w:t xml:space="preserve">Value</w:t>
+              <w:t xml:space="preserve">Giá trị</w:t>
             </w:r>
           </w:p>
         </w:tc>
@@ -3129,7 +3129,7 @@
                 <w:sz w:val="20"/>
                 <w:szCs w:val="20"/>
               </w:rPr>
-              <w:t xml:space="preserve">Source sheet</w:t>
+              <w:t xml:space="preserve">Bảng tính nguồn</w:t>
             </w:r>
           </w:p>
         </w:tc>
@@ -3159,7 +3159,7 @@
                 <w:sz w:val="20"/>
                 <w:szCs w:val="20"/>
               </w:rPr>
-              <w:t xml:space="preserve">Long-axis grid</w:t>
+              <w:t xml:space="preserve">Lưới trục dài</w:t>
             </w:r>
           </w:p>
         </w:tc>
@@ -3187,7 +3187,7 @@
                 <w:sz w:val="20"/>
                 <w:szCs w:val="20"/>
               </w:rPr>
-              <w:t xml:space="preserve">3,850 + 5,500 + 5,500 + 7,150 + 6,050 = 28,050 mm</w:t>
+              <w:t xml:space="preserve">3.850 + 5.500 + 5.500 + 7.150 + 6.050 = 28.050 mm</w:t>
             </w:r>
           </w:p>
         </w:tc>
@@ -3246,7 +3246,7 @@
                 <w:sz w:val="20"/>
                 <w:szCs w:val="20"/>
               </w:rPr>
-              <w:t xml:space="preserve">Plot depth</w:t>
+              <w:t xml:space="preserve">Độ sâu thửa đất</w:t>
             </w:r>
           </w:p>
         </w:tc>
@@ -3275,7 +3275,7 @@
                 <w:sz w:val="20"/>
                 <w:szCs w:val="20"/>
               </w:rPr>
-              <w:t xml:space="preserve">11,550 mm (living bay); 14,350 mm (dining wing)</w:t>
+              <w:t xml:space="preserve">11.550 mm (vịnh phòng khách); 14.350 mm (cánh phòng ăn)</w:t>
             </w:r>
           </w:p>
         </w:tc>
@@ -3509,7 +3509,7 @@
                 <w:sz w:val="20"/>
                 <w:szCs w:val="20"/>
               </w:rPr>
-              <w:t xml:space="preserve">Existing roof FFL</w:t>
+              <w:t xml:space="preserve">FFL mái hiện có</w:t>
             </w:r>
           </w:p>
         </w:tc>
@@ -3596,7 +3596,7 @@
                 <w:sz w:val="20"/>
                 <w:szCs w:val="20"/>
               </w:rPr>
-              <w:t xml:space="preserve">Overall height (existing)</w:t>
+              <w:t xml:space="preserve">Chiều cao tổng thể (hiện có)</w:t>
             </w:r>
           </w:p>
         </w:tc>
@@ -3625,7 +3625,7 @@
                 <w:sz w:val="20"/>
                 <w:szCs w:val="20"/>
               </w:rPr>
-              <w:t xml:space="preserve">~7.00 m (flat roof)</w:t>
+              <w:t xml:space="preserve">~7,00 m (mái bằng)</w:t>
             </w:r>
           </w:p>
         </w:tc>
@@ -3684,7 +3684,7 @@
                 <w:sz w:val="20"/>
                 <w:szCs w:val="20"/>
               </w:rPr>
-              <w:t xml:space="preserve">Floor-to-floor GF→L1</w:t>
+              <w:t xml:space="preserve">Từ sàn sang từ sàn GF→L1</w:t>
             </w:r>
           </w:p>
         </w:tc>
@@ -3712,7 +3712,7 @@
                 <w:sz w:val="20"/>
                 <w:szCs w:val="20"/>
               </w:rPr>
-              <w:t xml:space="preserve">~3.55 m</w:t>
+              <w:t xml:space="preserve">~3,55 m</w:t>
             </w:r>
           </w:p>
         </w:tc>
@@ -3768,7 +3768,7 @@
           <w:sz w:val="28"/>
           <w:szCs w:val="28"/>
         </w:rPr>
-        <w:t xml:space="preserve">4.2 Sheet carry-over</w:t>
+        <w:t xml:space="preserve">4.2 Chuyển sang tờ</w:t>
       </w:r>
     </w:p>
     <w:p>
@@ -3787,7 +3787,7 @@
           <w:sz w:val="22"/>
           <w:szCs w:val="22"/>
         </w:rPr>
-        <w:t xml:space="preserve">The ArAD package inventoried below is treated as the reference baseline. Sheets marked ● are updated under this concept; sheets marked ○ are retained verbatim for coordination with civil, MEP and landscape packages.</w:t>
+        <w:t xml:space="preserve">Gói ArAD được lập kế hoạch dưới đây được coi là đường cơ sở tham chiếu. Các tờ được đánh dấu ● được cập nhật theo khái niệm này; các tờ được đánh dấu ○ được giữ nguyên từ chữ để phối hợp với các gói dân sự, MEP và cảnh quan.</w:t>
       </w:r>
     </w:p>
     <w:tbl>
@@ -3833,7 +3833,7 @@
                 <w:sz w:val="20"/>
                 <w:szCs w:val="20"/>
               </w:rPr>
-              <w:t xml:space="preserve">Sheet group</w:t>
+              <w:t xml:space="preserve">Nhóm tờ</w:t>
             </w:r>
           </w:p>
         </w:tc>
@@ -3862,7 +3862,7 @@
                 <w:sz w:val="20"/>
                 <w:szCs w:val="20"/>
               </w:rPr>
-              <w:t xml:space="preserve">Sheets</w:t>
+              <w:t xml:space="preserve">Tờ</w:t>
             </w:r>
           </w:p>
         </w:tc>
@@ -3891,7 +3891,7 @@
                 <w:sz w:val="20"/>
                 <w:szCs w:val="20"/>
               </w:rPr>
-              <w:t xml:space="preserve">Carry-over</w:t>
+              <w:t xml:space="preserve">Chuyển sang</w:t>
             </w:r>
           </w:p>
         </w:tc>
@@ -3921,7 +3921,7 @@
                 <w:sz w:val="20"/>
                 <w:szCs w:val="20"/>
               </w:rPr>
-              <w:t xml:space="preserve">Plans</w:t>
+              <w:t xml:space="preserve">Mặt bằng</w:t>
             </w:r>
           </w:p>
         </w:tc>
@@ -3949,7 +3949,7 @@
                 <w:sz w:val="20"/>
                 <w:szCs w:val="20"/>
               </w:rPr>
-              <w:t xml:space="preserve">PLN-012 GF · PLN-013 L1 · PLN-014 Roof</w:t>
+              <w:t xml:space="preserve">PLN-012 GF · PLN-013 L1 · PLN-014 Mái</w:t>
             </w:r>
           </w:p>
         </w:tc>
@@ -3977,7 +3977,7 @@
                 <w:sz w:val="20"/>
                 <w:szCs w:val="20"/>
               </w:rPr>
-              <w:t xml:space="preserve">● Updated (L1 extended, roof pitched)</w:t>
+              <w:t xml:space="preserve">● Cập nhật (L1 mở rộng, mái heng)</w:t>
             </w:r>
           </w:p>
         </w:tc>
@@ -4008,7 +4008,7 @@
                 <w:sz w:val="20"/>
                 <w:szCs w:val="20"/>
               </w:rPr>
-              <w:t xml:space="preserve">Floor finishes</w:t>
+              <w:t xml:space="preserve">Hoàn thiện sàn</w:t>
             </w:r>
           </w:p>
         </w:tc>
@@ -4066,7 +4066,7 @@
                 <w:sz w:val="20"/>
                 <w:szCs w:val="20"/>
               </w:rPr>
-              <w:t xml:space="preserve">● Updated (interior palette re-set)</w:t>
+              <w:t xml:space="preserve">● Cập nhật (bảng màu nội thất được đặt lại)</w:t>
             </w:r>
           </w:p>
         </w:tc>
@@ -4096,7 +4096,7 @@
                 <w:sz w:val="20"/>
                 <w:szCs w:val="20"/>
               </w:rPr>
-              <w:t xml:space="preserve">Ceiling / RCP</w:t>
+              <w:t xml:space="preserve">Trần / RCP</w:t>
             </w:r>
           </w:p>
         </w:tc>
@@ -4152,7 +4152,7 @@
                 <w:sz w:val="20"/>
                 <w:szCs w:val="20"/>
               </w:rPr>
-              <w:t xml:space="preserve">● Updated (coffered / tongue-groove)</w:t>
+              <w:t xml:space="preserve">● Cập nhật (coffered / lưỡi-groove)</w:t>
             </w:r>
           </w:p>
         </w:tc>
@@ -4183,7 +4183,7 @@
                 <w:sz w:val="20"/>
                 <w:szCs w:val="20"/>
               </w:rPr>
-              <w:t xml:space="preserve">Elevations</w:t>
+              <w:t xml:space="preserve">Mặt đứng</w:t>
             </w:r>
           </w:p>
         </w:tc>
@@ -4212,7 +4212,7 @@
                 <w:sz w:val="20"/>
                 <w:szCs w:val="20"/>
               </w:rPr>
-              <w:t xml:space="preserve">ELE-031/032/033 · 1A–4B (eight elevations)</w:t>
+              <w:t xml:space="preserve">ELE-031/032/033 · 1A–4B (tám mặt đứng)</w:t>
             </w:r>
           </w:p>
         </w:tc>
@@ -4241,7 +4241,7 @@
                 <w:sz w:val="20"/>
                 <w:szCs w:val="20"/>
               </w:rPr>
-              <w:t xml:space="preserve">● Updated (colonial re-clad)</w:t>
+              <w:t xml:space="preserve">● Cập nhật (lót lại thuộc địa)</w:t>
             </w:r>
           </w:p>
         </w:tc>
@@ -4271,7 +4271,7 @@
                 <w:sz w:val="20"/>
                 <w:szCs w:val="20"/>
               </w:rPr>
-              <w:t xml:space="preserve">Sections</w:t>
+              <w:t xml:space="preserve">Tiết diện</w:t>
             </w:r>
           </w:p>
         </w:tc>
@@ -4299,7 +4299,7 @@
                 <w:sz w:val="20"/>
                 <w:szCs w:val="20"/>
               </w:rPr>
-              <w:t xml:space="preserve">SEC-041/042/043 · A–G (seven sections)</w:t>
+              <w:t xml:space="preserve">SEC-041/042/043 · A–G (bảy tiết diện)</w:t>
             </w:r>
           </w:p>
         </w:tc>
@@ -4327,7 +4327,7 @@
                 <w:sz w:val="20"/>
                 <w:szCs w:val="20"/>
               </w:rPr>
-              <w:t xml:space="preserve">● Updated (pitched roof profile)</w:t>
+              <w:t xml:space="preserve">● Cập nhật (hồ sơ mái heng)</w:t>
             </w:r>
           </w:p>
         </w:tc>
@@ -4358,7 +4358,7 @@
                 <w:sz w:val="20"/>
                 <w:szCs w:val="20"/>
               </w:rPr>
-              <w:t xml:space="preserve">Details</w:t>
+              <w:t xml:space="preserve">Chi tiết</w:t>
             </w:r>
           </w:p>
         </w:tc>
@@ -4387,7 +4387,7 @@
                 <w:sz w:val="20"/>
                 <w:szCs w:val="20"/>
               </w:rPr>
-              <w:t xml:space="preserve">SDET-075 bamboo screen · AD-series glazing · STW2 stone base</w:t>
+              <w:t xml:space="preserve">SDET-075 rèm tre · Chuỗi AD kính · cơ sở đá STW2</w:t>
             </w:r>
           </w:p>
         </w:tc>
@@ -4416,7 +4416,7 @@
                 <w:sz w:val="20"/>
                 <w:szCs w:val="20"/>
               </w:rPr>
-              <w:t xml:space="preserve">○ Retained; re-issued in teak / clay tile / stone</w:t>
+              <w:t xml:space="preserve">○ Giữ lại; phát hành lại trong teak / ngói đất nung / đá</w:t>
             </w:r>
           </w:p>
         </w:tc>
@@ -4441,7 +4441,7 @@
           <w:sz w:val="36"/>
           <w:szCs w:val="36"/>
         </w:rPr>
-        <w:t xml:space="preserve">05 · Design Strategy</w:t>
+        <w:t xml:space="preserve">05 · Chiến lược thiết kế</w:t>
       </w:r>
     </w:p>
     <w:p>
@@ -4469,7 +4469,7 @@
           <w:sz w:val="28"/>
           <w:szCs w:val="28"/>
         </w:rPr>
-        <w:t xml:space="preserve">5.1 Five moves</w:t>
+        <w:t xml:space="preserve">5.1 Năm động thái</w:t>
       </w:r>
     </w:p>
     <w:p>
@@ -4488,7 +4488,7 @@
           <w:sz w:val="22"/>
           <w:szCs w:val="22"/>
         </w:rPr>
-        <w:t xml:space="preserve">Move 1 · Extend L1 to the full GF footprint.</w:t>
+        <w:t xml:space="preserve">Động thái 1 · Mở rộng L1 đến toàn bộ footprint tầng trệt.</w:t>
       </w:r>
       <w:r>
         <w:rPr>
@@ -4501,7 +4501,7 @@
           <w:sz w:val="22"/>
           <w:szCs w:val="22"/>
         </w:rPr>
-        <w:t xml:space="preserve">  The existing plan leaves a ~148 m² open roof terrace over the dining and primary-suite wings. This is the single biggest GFA opportunity; the concept converts that void into conditioned floor, giving three additional guest suites plus an upper lounge while keeping ridge height below 9 m.</w:t>
+        <w:t xml:space="preserve">  Kế hoạch hiện có để lại một sân thượng 148 m² mở trên cánh phòng ăn và phòng ngủ chính. Đây là cơ hội GFA duy nhất lớn nhất; khái niệm chuyển đổi khoảng trống đó thành sàn điều hòa, cung cấp ba phòng khách bổ sung cộng với phòng lounge trên tầng 1 trong khi giữ chiều cao đỉnh mái dưới 9 m.</w:t>
       </w:r>
     </w:p>
     <w:p>
@@ -4520,7 +4520,7 @@
           <w:sz w:val="22"/>
           <w:szCs w:val="22"/>
         </w:rPr>
-        <w:t xml:space="preserve">Move 2 · Pitch the roof.</w:t>
+        <w:t xml:space="preserve">Động thái 2 · Heng mái.</w:t>
       </w:r>
       <w:r>
         <w:rPr>
@@ -4533,7 +4533,7 @@
           <w:sz w:val="22"/>
           <w:szCs w:val="22"/>
         </w:rPr>
-        <w:t xml:space="preserve">  The flat ArAD roof at +6.97 is replaced with a 25° hipped clay-tile roof rising to ridge ~+9.00. The pitched profile reads as Capella-peer at 100 m distance and is the dominant image in bay-view photography.</w:t>
+        <w:t xml:space="preserve">  Mái bằng ArAD ở +6,97 được thay thế bằng mái ngói đất nung heng 25° tăng lên đỉnh ~+9,00. Hồ sơ heng đọc được như đối tác Capella ở khoảng cách 100 m và là hình ảnh thống trị trong nhiếp ảnh tầm nhìn vịnh.</w:t>
       </w:r>
     </w:p>
     <w:p>
@@ -4552,7 +4552,7 @@
           <w:sz w:val="22"/>
           <w:szCs w:val="22"/>
         </w:rPr>
-        <w:t xml:space="preserve">Move 3 · Re-clad in colonial white.</w:t>
+        <w:t xml:space="preserve">Động thái 3 · Lót lại trong trắng thuộc địa.</w:t>
       </w:r>
       <w:r>
         <w:rPr>
@@ -4565,7 +4565,7 @@
           <w:sz w:val="22"/>
           <w:szCs w:val="22"/>
         </w:rPr>
-        <w:t xml:space="preserve">  Stone base (retained where existing) to +3.18; white lime-washed render to underside of eaves; teak louvered shutters on all openings to the south and west; deep reveals (300 mm) to give plasticity in raking sunlight.</w:t>
+        <w:t xml:space="preserve">  Cơ sở đá (giữ lại nơi hiện có) đến +3,18; sơn vôi trang trí trắng đến gầm mái hiên; cửa chớp gỗ teak lam trên tất cả các lỗ mở phía nam và tây; tiết lộ sâu (300 mm) để tạo tính dẻo dai trong ánh nắng làm ngang.</w:t>
       </w:r>
     </w:p>
     <w:p>
@@ -4584,7 +4584,7 @@
           <w:sz w:val="22"/>
           <w:szCs w:val="22"/>
         </w:rPr>
-        <w:t xml:space="preserve">Move 4 · Wrap the bay elevation in veranda.</w:t>
+        <w:t xml:space="preserve">Động thái 4 · Bao bọc mặt đứng vịnh trong hành lang có mái.</w:t>
       </w:r>
       <w:r>
         <w:rPr>
@@ -4597,7 +4597,7 @@
           <w:sz w:val="22"/>
           <w:szCs w:val="22"/>
         </w:rPr>
-        <w:t xml:space="preserve">  A 2.4 m cantilevered veranda along the south (bay-facing) and west elevations on both GF and L1 — the classic colonial bungalow move — shades the glazing, protects the render from rain and gives every principal room a direct outdoor-to-bay transition.</w:t>
+        <w:t xml:space="preserve">  Hành lang có mái quá hang 2,4 m dọc theo mặt đứng phía nam (hướng vịnh) và tây trên cả tầng trệt và tầng 1 — động thái bungalow thuộc địa cổ điển — che phủ kính, bảo vệ sơn vôi từ mưa và cung cấp cho mỗi phòng chính một quá cảnh ngoài trời-đến-vịnh trực tiếp.</w:t>
       </w:r>
     </w:p>
     <w:p>
@@ -4616,7 +4616,7 @@
           <w:sz w:val="22"/>
           <w:szCs w:val="22"/>
         </w:rPr>
-        <w:t xml:space="preserve">Move 5 · Re-interior around an ivory/teak/brass palette.</w:t>
+        <w:t xml:space="preserve">Động thái 5 · Nội thất lại quanh bảng màu ốm/teak/đồng.</w:t>
       </w:r>
       <w:r>
         <w:rPr>
@@ -4629,7 +4629,7 @@
           <w:sz w:val="22"/>
           <w:szCs w:val="22"/>
         </w:rPr>
-        <w:t xml:space="preserve">  Replace the contemporary interior with rough-plastered walls in warm ivory, herringbone teak floors, woven raffia ceiling panels, aged-brass hardware, linen upholstery in oat and ink, art and textiles sourced from Hạ Long / Đông Hồ craft traditions.</w:t>
+        <w:t xml:space="preserve">  Thay thế nội thất đương đại bằng tường sơn thô ốm ấm, sàn ngói teak xương cá, bảng tấm raffia dệt, phần cứng đồng cũ, bọc linen trong lúa mì và mực, nghệ thuật và vải dệt có nguồn gốc từ truyền thống thủ công Hạ Long / Đông Hồ.</w:t>
       </w:r>
     </w:p>
     <w:p>
@@ -4646,7 +4646,7 @@
           <w:sz w:val="28"/>
           <w:szCs w:val="28"/>
         </w:rPr>
-        <w:t xml:space="preserve">5.2 Program brief</w:t>
+        <w:t xml:space="preserve">5.2 Tóm tắt chương trình</w:t>
       </w:r>
     </w:p>
     <w:tbl>
@@ -4692,7 +4692,7 @@
                 <w:sz w:val="20"/>
                 <w:szCs w:val="20"/>
               </w:rPr>
-              <w:t xml:space="preserve">Level</w:t>
+              <w:t xml:space="preserve">Tầng</w:t>
             </w:r>
           </w:p>
         </w:tc>
@@ -4721,7 +4721,7 @@
                 <w:sz w:val="20"/>
                 <w:szCs w:val="20"/>
               </w:rPr>
-              <w:t xml:space="preserve">Rooms</w:t>
+              <w:t xml:space="preserve">Phòng</w:t>
             </w:r>
           </w:p>
         </w:tc>
@@ -4750,7 +4750,7 @@
                 <w:sz w:val="20"/>
                 <w:szCs w:val="20"/>
               </w:rPr>
-              <w:t xml:space="preserve">Area (approx.)</w:t>
+              <w:t xml:space="preserve">Diện tích (khoảng)</w:t>
             </w:r>
           </w:p>
         </w:tc>
@@ -4808,7 +4808,7 @@
                 <w:sz w:val="20"/>
                 <w:szCs w:val="20"/>
               </w:rPr>
-              <w:t xml:space="preserve">Porte-cochère · formal entry foyer · formal living (bay) · dining (bay) · family living · study / library · open kitchen · service kitchen · pantry · primary suite + dressing + ensuite · powder · maid · utility · south + west veranda (2.4 m)</w:t>
+              <w:t xml:space="preserve">Porte-cochère · sảnh vào chính thức · phòng khách chính thức (vịnh) · phòng ăn (vịnh) · phòng khách gia đình · phòng học / thư viện · bếp mở · bếp dịch vụ · tủ đựa · phòng ngủ chính + tủ quần áo + phòng tắm · phòng bột · phòng hầu · công trình · hành lang có mái phía nam + tây (2,4 m)</w:t>
             </w:r>
           </w:p>
         </w:tc>
@@ -4836,7 +4836,7 @@
                 <w:sz w:val="20"/>
                 <w:szCs w:val="20"/>
               </w:rPr>
-              <w:t xml:space="preserve">300 m² enclosed + ~120 m² covered veranda</w:t>
+              <w:t xml:space="preserve">300 m² kín + ~120 m² hành lang có mái che phủ</w:t>
             </w:r>
           </w:p>
         </w:tc>
@@ -4867,7 +4867,7 @@
                 <w:sz w:val="20"/>
                 <w:szCs w:val="20"/>
               </w:rPr>
-              <w:t xml:space="preserve">L1 (~300 m², new full match)</w:t>
+              <w:t xml:space="preserve">L1 (~300 m², full match mới)</w:t>
             </w:r>
           </w:p>
         </w:tc>
@@ -4896,7 +4896,7 @@
                 <w:sz w:val="20"/>
                 <w:szCs w:val="20"/>
               </w:rPr>
-              <w:t xml:space="preserve">Guest suite 1 (bay, king) · Guest suite 2 (bay, king) · Guest suite 3 (garden, twin) · guest lounge / gallery · reading nook · upper veranda (bay)</w:t>
+              <w:t xml:space="preserve">Phòng khách 1 (vịnh, king) · Phòng khách 2 (vịnh, king) · Phòng khách 3 (vườn, đôi) · phòng lounge khách / phòng trưng bày · xem góc · hành lang có mái trên tầng (vịnh)</w:t>
             </w:r>
           </w:p>
         </w:tc>
@@ -4925,7 +4925,7 @@
                 <w:sz w:val="20"/>
                 <w:szCs w:val="20"/>
               </w:rPr>
-              <w:t xml:space="preserve">300 m² enclosed + ~90 m² covered upper veranda</w:t>
+              <w:t xml:space="preserve">300 m² kín + ~90 m² hành lang có mái trên tầng che phủ</w:t>
             </w:r>
           </w:p>
         </w:tc>
@@ -4955,7 +4955,7 @@
                 <w:sz w:val="20"/>
                 <w:szCs w:val="20"/>
               </w:rPr>
-              <w:t xml:space="preserve">Roof</w:t>
+              <w:t xml:space="preserve">Mái</w:t>
             </w:r>
           </w:p>
         </w:tc>
@@ -4983,7 +4983,7 @@
                 <w:sz w:val="20"/>
                 <w:szCs w:val="20"/>
               </w:rPr>
-              <w:t xml:space="preserve">Hipped clay-tile, 25°, copper ridge + gutters; ridge vent; concealed PV option at rear slope</w:t>
+              <w:t xml:space="preserve">Ngói đất nung heng, 25°, đỉnh đồng + máng; lỗ thông gió đỉnh; tùy chọn PV ẩn ở sườn phía sau</w:t>
             </w:r>
           </w:p>
         </w:tc>
@@ -5042,7 +5042,7 @@
                 <w:sz w:val="20"/>
                 <w:szCs w:val="20"/>
               </w:rPr>
-              <w:t xml:space="preserve">Site</w:t>
+              <w:t xml:space="preserve">Khu đất</w:t>
             </w:r>
           </w:p>
         </w:tc>
@@ -5071,7 +5071,7 @@
                 <w:sz w:val="20"/>
                 <w:szCs w:val="20"/>
               </w:rPr>
-              <w:t xml:space="preserve">Infinity pool (retained, re-edged in tumbled basalt) · pool deck in teak · detached sala pavilion · outdoor kitchen / BBQ · service yard at north · motor court with frangipani pair · gardener's store</w:t>
+              <w:t xml:space="preserve">Hồ bơi vô cực (giữ lại, chỉnh sửa cạnh trong đá basalt lăn) · sân hồ bơi trong teak · sân khấu phòng tách biệt · bếp / BBQ ngoài trời · sân dịch vụ phía bắc · sân xe motor với cặp frangipani · kho của người làm vườn</w:t>
             </w:r>
           </w:p>
         </w:tc>
@@ -5100,7 +5100,7 @@
                 <w:sz w:val="20"/>
                 <w:szCs w:val="20"/>
               </w:rPr>
-              <w:t xml:space="preserve">~540 m² external program</w:t>
+              <w:t xml:space="preserve">~540 m² chương trình bên ngoài</w:t>
             </w:r>
           </w:p>
         </w:tc>
@@ -5125,7 +5125,7 @@
           <w:sz w:val="36"/>
           <w:szCs w:val="36"/>
         </w:rPr>
-        <w:t xml:space="preserve">06 · Massing, Plans, Elevations</w:t>
+        <w:t xml:space="preserve">06 · Khối lượng, Mặt bằng, Mặt đứng</w:t>
       </w:r>
     </w:p>
     <w:p>
@@ -5153,7 +5153,7 @@
           <w:sz w:val="28"/>
           <w:szCs w:val="28"/>
         </w:rPr>
-        <w:t xml:space="preserve">6.1 Massing diagram (narrative)</w:t>
+        <w:t xml:space="preserve">6.1 Sơ đồ khối lượng (tường thuật)</w:t>
       </w:r>
     </w:p>
     <w:p>
@@ -5172,7 +5172,7 @@
           <w:sz w:val="22"/>
           <w:szCs w:val="22"/>
         </w:rPr>
-        <w:t xml:space="preserve">Looking south from the motor court, the villa presents a long linear mass parallel to the bay. The GF base is a continuous white-rendered volume of 28.05 × 11.55 m with a projecting dining wing to the east (+2.8 m). The L1, now extended to the full GF outline, sits directly above with a 300 mm overhang forming the veranda ceiling. A 25° hipped clay-tile roof covers the whole, peaking centrally on gridline C and hipping to the east and west gables. The roof line reads as a single unified profile — the single most important change from the existing flat-roofed scheme.</w:t>
+        <w:t xml:space="preserve">Nhìn phía nam từ sân xe motor, biệt thự trình bày một khối tuyến tính dài song song với vịnh. Cơ sở tầng trệt là một thể tích liên tục sơn vôi trắng 28,05 × 11,55 m với cánh phòng ăn nổi lên (+2,8 m). Tầng 1, bây giờ được mở rộng đến toàn bộ đường bao tầng trệt, nằm trực tiếp ở trên với một quá hang 300 mm tạo thành trần hành lang có mái. Mái ngói đất nung heng 25° che phủ toàn bộ, đỉnh trung tâm trên đường thẳng C và hep sang gable phía đông và tây. Đường mái đọc như một hồ sơ thống nhất — thay đổi quan trọng nhất từ ​​phương án mái bằng hiện có.</w:t>
       </w:r>
     </w:p>
     <w:p>
@@ -5189,7 +5189,7 @@
           <w:sz w:val="28"/>
           <w:szCs w:val="28"/>
         </w:rPr>
-        <w:t xml:space="preserve">6.2 Ground floor plan — narrative</w:t>
+        <w:t xml:space="preserve">6.2 Mặt bằng tầng trệt — tường thuật</w:t>
       </w:r>
     </w:p>
     <w:p>
@@ -5208,7 +5208,7 @@
           <w:sz w:val="22"/>
           <w:szCs w:val="22"/>
         </w:rPr>
-        <w:t xml:space="preserve">Arrival is from the north onto a paved motor court flanked by a pair of mature frangipani trees. The porte-cochère sits on gridline C–D; beyond it, a double-height foyer with coffered teak ceiling opens left to the formal living room (bay view, full-height sliding glass to south veranda) and right to the formal dining (bay view, 10-seat teak table). A service spine at the north edge contains the pantry, service kitchen, maid's room and utility — keeping back-of-house invisible from the bay elevation. The primary suite occupies the west end of the GF, with its own covered terrace stepping directly down to the pool. The east end carries the study/library (half-panelled teak, writing desk, three armchairs) and a guest powder room.</w:t>
+        <w:t xml:space="preserve">Sự đến là từ phía bắc vào một sân xe motor được lát gạch được bao quanh bởi một cặp cây frangipani trưởng thành. Porte-cochère nằm trên đường thẳng C–D; vượt quá nó, một sảnh cao gấp đôi với trần teak coffered mở bên trái vào phòng khách chính thức (tầm nhìn vịnh, cửa kính trượt toàn chiều cao đến hành lang có mái phía nam) và phía bên phải đến phòng ăn chính thức (tầm nhìn vịnh, bàn teak 10 chỗ). Một sống lưng dịch vụ ở cạnh phía bắc chứa tủ để, bếp dịch vụ, phòng hầu và công trình — giữ lại phía sau nhà vô hình từ mặt đứng hướng vịnh. Phòng ngủ chính chiếm đầu phía tây của tầng trệt, với sân hiên che phủ riêng của nó bước trực tiếp xuống sân hồ bơi. Đầu phía đông mang phòng học/thư viện (một nửa ốp teak, bàn viết, ba ghế bành) và phòng vệ sinh bột khách.</w:t>
       </w:r>
     </w:p>
     <w:p>
@@ -5225,7 +5225,7 @@
           <w:sz w:val="28"/>
           <w:szCs w:val="28"/>
         </w:rPr>
-        <w:t xml:space="preserve">6.3 First floor plan — the extension</w:t>
+        <w:t xml:space="preserve">6.3 Mặt bằng tầng 1 — mở rộng</w:t>
       </w:r>
     </w:p>
     <w:p>
@@ -5244,7 +5244,7 @@
           <w:sz w:val="22"/>
           <w:szCs w:val="22"/>
         </w:rPr>
-        <w:t xml:space="preserve">L1 mirrors the GF outline (28.05 × 11.55 m plus the 14.35 m dining-wing projection). The plan is organised around a central axial corridor on gridline C running east–west. Two principal guest suites (Suite A and Suite B) sit on the south, bay-facing wall, each with a private slice of the 2.4 m upper veranda. Suite C (twin-bed, garden view) sits on the north. The central ‘gallery' widens over the GF foyer into a double-height reading atrium with a roof lantern (the only break in the hipped roof). At the east end, what was the open dining-roof terrace becomes the guest lounge and small library.</w:t>
+        <w:t xml:space="preserve">L1 phản chiếu đường bao tầng trệt (28,05 × 11,55 m cộng với hình chiếu cánh phòng ăn 14,35 m). Kế hoạch được sắp xếp quanh một hành lang trục trung tâm trên đường thẳng C chạy từ đông sang tây. Hai phòng khách chính (Phòng A và Phòng B) nằm trên tường phía nam hướng vịnh, mỗi phòng có một lát riêng của hành lang có mái trên tầng 2,4 m. Phòng C (giường đôi, tầm nhìn vườn) nằm phía bắc. 'Phòng trưng bày' trung tâm mở rộng trên sảnh vào tầng trệt thành một sân thượng đọc kép với một hộp sáng mái (khoảng cách duy nhất từ ​​mái heng). Ở đầu phía đông, những gì là một sân thượng mái bằng phòng ăn mở trở thành phòng lounge khách và thư viện nhỏ.</w:t>
       </w:r>
     </w:p>
     <w:p>
@@ -5261,7 +5261,7 @@
           <w:sz w:val="28"/>
           <w:szCs w:val="28"/>
         </w:rPr>
-        <w:t xml:space="preserve">6.4 Elevations</w:t>
+        <w:t xml:space="preserve">6.4 Mặt đứng</w:t>
       </w:r>
     </w:p>
     <w:tbl>
@@ -5307,7 +5307,7 @@
                 <w:sz w:val="20"/>
                 <w:szCs w:val="20"/>
               </w:rPr>
-              <w:t xml:space="preserve">Elevation</w:t>
+              <w:t xml:space="preserve">Mặt đứng</w:t>
             </w:r>
           </w:p>
         </w:tc>
@@ -5336,7 +5336,7 @@
                 <w:sz w:val="20"/>
                 <w:szCs w:val="20"/>
               </w:rPr>
-              <w:t xml:space="preserve">Role</w:t>
+              <w:t xml:space="preserve">Vai trò</w:t>
             </w:r>
           </w:p>
         </w:tc>
@@ -5365,7 +5365,7 @@
                 <w:sz w:val="20"/>
                 <w:szCs w:val="20"/>
               </w:rPr>
-              <w:t xml:space="preserve">Key notes</w:t>
+              <w:t xml:space="preserve">Ghi chú chính</w:t>
             </w:r>
           </w:p>
         </w:tc>
@@ -5395,7 +5395,7 @@
                 <w:sz w:val="20"/>
                 <w:szCs w:val="20"/>
               </w:rPr>
-              <w:t xml:space="preserve">South (1A/1B) — bay</w:t>
+              <w:t xml:space="preserve">Nam (1A/1B) — vịnh</w:t>
             </w:r>
           </w:p>
         </w:tc>
@@ -5423,7 +5423,7 @@
                 <w:sz w:val="20"/>
                 <w:szCs w:val="20"/>
               </w:rPr>
-              <w:t xml:space="preserve">Hero image</w:t>
+              <w:t xml:space="preserve">Hình ảnh anh hùng</w:t>
             </w:r>
           </w:p>
         </w:tc>
@@ -5451,7 +5451,7 @@
                 <w:sz w:val="20"/>
                 <w:szCs w:val="20"/>
               </w:rPr>
-              <w:t xml:space="preserve">Full 28 m veranda run; 5 bays of teak louvered shutters; L1 over-sailing the GF at 2.4 m; clay-tile roof pitching down to +6.50 eave</w:t>
+              <w:t xml:space="preserve">Chạy hành lang có mái 28 m đầy đủ; 5 vịnh cửa chớp lam teak; L1 quá hang tầng trệt ở 2,4 m; mái ngói đất nung heng xuống đến +6,50 mái hiên</w:t>
             </w:r>
           </w:p>
         </w:tc>
@@ -5482,7 +5482,7 @@
                 <w:sz w:val="20"/>
                 <w:szCs w:val="20"/>
               </w:rPr>
-              <w:t xml:space="preserve">East (2A/2B) — dining wing</w:t>
+              <w:t xml:space="preserve">Đông (2A/2B) — cánh phòng ăn</w:t>
             </w:r>
           </w:p>
         </w:tc>
@@ -5511,7 +5511,7 @@
                 <w:sz w:val="20"/>
                 <w:szCs w:val="20"/>
               </w:rPr>
-              <w:t xml:space="preserve">Secondary hero</w:t>
+              <w:t xml:space="preserve">Hình ảnh anh hùng thứ cấp</w:t>
             </w:r>
           </w:p>
         </w:tc>
@@ -5540,7 +5540,7 @@
                 <w:sz w:val="20"/>
                 <w:szCs w:val="20"/>
               </w:rPr>
-              <w:t xml:space="preserve">Projecting gable end with a jack-arch teak window to the dining room; sala pavilion in foreground</w:t>
+              <w:t xml:space="preserve">Cạnh gable nổi lên với cửa sổ teak vòm jack đến phòng ăn; sân khấu phòng ở tiền cảnh</w:t>
             </w:r>
           </w:p>
         </w:tc>
@@ -5570,7 +5570,7 @@
                 <w:sz w:val="20"/>
                 <w:szCs w:val="20"/>
               </w:rPr>
-              <w:t xml:space="preserve">North (3A/3B) — arrival</w:t>
+              <w:t xml:space="preserve">Bắc (3A/3B) — sự đến</w:t>
             </w:r>
           </w:p>
         </w:tc>
@@ -5598,7 +5598,7 @@
                 <w:sz w:val="20"/>
                 <w:szCs w:val="20"/>
               </w:rPr>
-              <w:t xml:space="preserve">Arrival</w:t>
+              <w:t xml:space="preserve">Sự đến</w:t>
             </w:r>
           </w:p>
         </w:tc>
@@ -5626,7 +5626,7 @@
                 <w:sz w:val="20"/>
                 <w:szCs w:val="20"/>
               </w:rPr>
-              <w:t xml:space="preserve">Porte-cochère with stone base, double-leaf teak doors, clerestory lantern above foyer; service yard screened by a low masonry wall</w:t>
+              <w:t xml:space="preserve">Porte-cochère với cơ sở đá, cửa teak lá kép, hộp sáng clerestory ở trên sảnh; sân dịch vụ được che chắn bởi một bức tường phấn thấp</w:t>
             </w:r>
           </w:p>
         </w:tc>
@@ -5657,7 +5657,7 @@
                 <w:sz w:val="20"/>
                 <w:szCs w:val="20"/>
               </w:rPr>
-              <w:t xml:space="preserve">West (4A/4B) — primary suite</w:t>
+              <w:t xml:space="preserve">Tây (4A/4B) — phòng ngủ chính</w:t>
             </w:r>
           </w:p>
         </w:tc>
@@ -5686,7 +5686,7 @@
                 <w:sz w:val="20"/>
                 <w:szCs w:val="20"/>
               </w:rPr>
-              <w:t xml:space="preserve">Private</w:t>
+              <w:t xml:space="preserve">Tư nhân</w:t>
             </w:r>
           </w:p>
         </w:tc>
@@ -5715,7 +5715,7 @@
                 <w:sz w:val="20"/>
                 <w:szCs w:val="20"/>
               </w:rPr>
-              <w:t xml:space="preserve">Primary suite terrace; roof hips in toward centre; solid render with two shuttered windows only</w:t>
+              <w:t xml:space="preserve">Sân hiên phòng ngủ chính; hip mái hướng vào trung tâm; kết xuất rắn với chỉ hai cửa chớp</w:t>
             </w:r>
           </w:p>
         </w:tc>
@@ -5735,7 +5735,7 @@
           <w:sz w:val="28"/>
           <w:szCs w:val="28"/>
         </w:rPr>
-        <w:t xml:space="preserve">6.5 Section A–A (transverse)</w:t>
+        <w:t xml:space="preserve">6.5 Tiết diện A–A (ngang)</w:t>
       </w:r>
     </w:p>
     <w:p>
@@ -5754,7 +5754,7 @@
           <w:sz w:val="22"/>
           <w:szCs w:val="22"/>
         </w:rPr>
-        <w:t xml:space="preserve">Cut north–south through gridline D, the section reads (from bay to service): 2.4 m veranda · 5.5 m formal living (GF) / guest suite (L1) · 1.5 m circulation spine · 2.2 m service zone. Floor-to-floor GF = 3.55 m; L1 = 3.20 m; roof ridge at central gridline = +9.00 m. The pitched roof geometry is set so that every principal bay-facing room has a minimum 3.0 m ceiling height at the head of the bed; the ridge line is concealed from the pool deck by the upper veranda eave.</w:t>
+        <w:t xml:space="preserve">Cắt từ bắc sang nam thông qua đường thẳng D, tiết diện đọc (từ vịnh đến dịch vụ): hành lang có mái 2,4 m · phòng khách chính 5,5 m (tầng trệt) / phòng khách (L1) · sống lưng lưu thông 1,5 m · khu dịch vụ 2,2 m. Tầng trệt từ sàn sang sàn = 3,55 m; L1 = 3,20 m; đỉnh mái ở đường thẳng trung tâm = +9,00 m. Hình học mái heng được đặt sao cho mỗi vịnh chính hướng vịnh có chiều cao trần tối thiểu 3,0 m ở đầu giường; đường đỉnh được che chắn từ sân hồ bơi bởi nắp mái hiên hành lang có mái trên tầng.</w:t>
       </w:r>
     </w:p>
     <w:p>
@@ -5776,7 +5776,7 @@
           <w:sz w:val="36"/>
           <w:szCs w:val="36"/>
         </w:rPr>
-        <w:t xml:space="preserve">07 · Materials, Finishes, Colour</w:t>
+        <w:t xml:space="preserve">07 · Vật liệu, Hoàn thiện, Màu sắc</w:t>
       </w:r>
     </w:p>
     <w:p>
@@ -5804,7 +5804,7 @@
           <w:sz w:val="28"/>
           <w:szCs w:val="28"/>
         </w:rPr>
-        <w:t xml:space="preserve">7.1 External palette</w:t>
+        <w:t xml:space="preserve">7.1 Bảng màu bên ngoài</w:t>
       </w:r>
     </w:p>
     <w:tbl>
@@ -5851,7 +5851,7 @@
                 <w:sz w:val="20"/>
                 <w:szCs w:val="20"/>
               </w:rPr>
-              <w:t xml:space="preserve">Element</w:t>
+              <w:t xml:space="preserve">Phần tử</w:t>
             </w:r>
           </w:p>
         </w:tc>
@@ -5880,7 +5880,7 @@
                 <w:sz w:val="20"/>
                 <w:szCs w:val="20"/>
               </w:rPr>
-              <w:t xml:space="preserve">Material</w:t>
+              <w:t xml:space="preserve">Vật liệu</w:t>
             </w:r>
           </w:p>
         </w:tc>
@@ -5909,7 +5909,7 @@
                 <w:sz w:val="20"/>
                 <w:szCs w:val="20"/>
               </w:rPr>
-              <w:t xml:space="preserve">Colour / finish</w:t>
+              <w:t xml:space="preserve">Màu sắc / hoàn thiện</w:t>
             </w:r>
           </w:p>
         </w:tc>
@@ -5938,7 +5938,7 @@
                 <w:sz w:val="20"/>
                 <w:szCs w:val="20"/>
               </w:rPr>
-              <w:t xml:space="preserve">UNESCO-buffer note</w:t>
+              <w:t xml:space="preserve">Ghi chú vùng đệm UNESCO</w:t>
             </w:r>
           </w:p>
         </w:tc>
@@ -5968,7 +5968,7 @@
                 <w:sz w:val="20"/>
                 <w:szCs w:val="20"/>
               </w:rPr>
-              <w:t xml:space="preserve">Roof</w:t>
+              <w:t xml:space="preserve">Mái</w:t>
             </w:r>
           </w:p>
         </w:tc>
@@ -5996,7 +5996,7 @@
                 <w:sz w:val="20"/>
                 <w:szCs w:val="20"/>
               </w:rPr>
-              <w:t xml:space="preserve">Hand-made clay pan tile, hipped, 25°</w:t>
+              <w:t xml:space="preserve">Ngói đất nung làm bằng tay, heng, 25°</w:t>
             </w:r>
           </w:p>
         </w:tc>
@@ -6024,7 +6024,7 @@
                 <w:sz w:val="20"/>
                 <w:szCs w:val="20"/>
               </w:rPr>
-              <w:t xml:space="preserve">Weathered terracotta (Capella copper match)</w:t>
+              <w:t xml:space="preserve">Đất nung che phủ (kết hợp mành đồng Capella)</w:t>
             </w:r>
           </w:p>
         </w:tc>
@@ -6052,7 +6052,7 @@
                 <w:sz w:val="20"/>
                 <w:szCs w:val="20"/>
               </w:rPr>
-              <w:t xml:space="preserve">Muted, matte, no metallic glint</w:t>
+              <w:t xml:space="preserve">Muted, matte, không lấp lánh kim loại</w:t>
             </w:r>
           </w:p>
         </w:tc>
@@ -6083,7 +6083,7 @@
                 <w:sz w:val="20"/>
                 <w:szCs w:val="20"/>
               </w:rPr>
-              <w:t xml:space="preserve">Ridge + gutters</w:t>
+              <w:t xml:space="preserve">Đỉnh + máng</w:t>
             </w:r>
           </w:p>
         </w:tc>
@@ -6112,7 +6112,7 @@
                 <w:sz w:val="20"/>
                 <w:szCs w:val="20"/>
               </w:rPr>
-              <w:t xml:space="preserve">Patinated copper</w:t>
+              <w:t xml:space="preserve">Đồng được tự động hóa</w:t>
             </w:r>
           </w:p>
         </w:tc>
@@ -6141,7 +6141,7 @@
                 <w:sz w:val="20"/>
                 <w:szCs w:val="20"/>
               </w:rPr>
-              <w:t xml:space="preserve">Verdigris over 5 years</w:t>
+              <w:t xml:space="preserve">Verdigris trong 5 năm</w:t>
             </w:r>
           </w:p>
         </w:tc>
@@ -6170,7 +6170,7 @@
                 <w:sz w:val="20"/>
                 <w:szCs w:val="20"/>
               </w:rPr>
-              <w:t xml:space="preserve">Aged finish at handover — pre-weathered</w:t>
+              <w:t xml:space="preserve">Hoàn thiện già ở bàn giao — được rửa sạch trước</w:t>
             </w:r>
           </w:p>
         </w:tc>
@@ -6200,7 +6200,7 @@
                 <w:sz w:val="20"/>
                 <w:szCs w:val="20"/>
               </w:rPr>
-              <w:t xml:space="preserve">Walls (upper)</w:t>
+              <w:t xml:space="preserve">Tường (trên)</w:t>
             </w:r>
           </w:p>
         </w:tc>
@@ -6228,7 +6228,7 @@
                 <w:sz w:val="20"/>
                 <w:szCs w:val="20"/>
               </w:rPr>
-              <w:t xml:space="preserve">Lime-wash render over masonry</w:t>
+              <w:t xml:space="preserve">Sơn vôi trang trí trên thạch cao</w:t>
             </w:r>
           </w:p>
         </w:tc>
@@ -6256,7 +6256,7 @@
                 <w:sz w:val="20"/>
                 <w:szCs w:val="20"/>
               </w:rPr>
-              <w:t xml:space="preserve">Warm ivory (NCS S 1005-Y20R)</w:t>
+              <w:t xml:space="preserve">Ốm ấm (NCS S 1005-Y20R)</w:t>
             </w:r>
           </w:p>
         </w:tc>
@@ -6284,7 +6284,7 @@
                 <w:sz w:val="20"/>
                 <w:szCs w:val="20"/>
               </w:rPr>
-              <w:t xml:space="preserve">Non-reflective, no colour competing with karst</w:t>
+              <w:t xml:space="preserve">Không phản xạ, không có màu sắc cạnh tranh với núi đá vôi</w:t>
             </w:r>
           </w:p>
         </w:tc>
@@ -6315,7 +6315,7 @@
                 <w:sz w:val="20"/>
                 <w:szCs w:val="20"/>
               </w:rPr>
-              <w:t xml:space="preserve">Walls (base to +3.18)</w:t>
+              <w:t xml:space="preserve">Tường (cơ sở đến +3,18)</w:t>
             </w:r>
           </w:p>
         </w:tc>
@@ -6344,7 +6344,7 @@
                 <w:sz w:val="20"/>
                 <w:szCs w:val="20"/>
               </w:rPr>
-              <w:t xml:space="preserve">Retained STW2 split-face basalt</w:t>
+              <w:t xml:space="preserve">Basalt chia mặt STW2 được giữ lại</w:t>
             </w:r>
           </w:p>
         </w:tc>
@@ -6373,7 +6373,7 @@
                 <w:sz w:val="20"/>
                 <w:szCs w:val="20"/>
               </w:rPr>
-              <w:t xml:space="preserve">Natural dark charcoal</w:t>
+              <w:t xml:space="preserve">Nguyên bản tối than</w:t>
             </w:r>
           </w:p>
         </w:tc>
@@ -6402,7 +6402,7 @@
                 <w:sz w:val="20"/>
                 <w:szCs w:val="20"/>
               </w:rPr>
-              <w:t xml:space="preserve">Existing finish, no change</w:t>
+              <w:t xml:space="preserve">Hoàn thiện hiện có, không thay đổi</w:t>
             </w:r>
           </w:p>
         </w:tc>
@@ -6432,7 +6432,7 @@
                 <w:sz w:val="20"/>
                 <w:szCs w:val="20"/>
               </w:rPr>
-              <w:t xml:space="preserve">Shutters / louvres</w:t>
+              <w:t xml:space="preserve">Cửa chớp / lam</w:t>
             </w:r>
           </w:p>
         </w:tc>
@@ -6460,7 +6460,7 @@
                 <w:sz w:val="20"/>
                 <w:szCs w:val="20"/>
               </w:rPr>
-              <w:t xml:space="preserve">FSC teak, oiled</w:t>
+              <w:t xml:space="preserve">Teak FSC, dầu</w:t>
             </w:r>
           </w:p>
         </w:tc>
@@ -6488,7 +6488,7 @@
                 <w:sz w:val="20"/>
                 <w:szCs w:val="20"/>
               </w:rPr>
-              <w:t xml:space="preserve">Ink-charcoal stain, matte</w:t>
+              <w:t xml:space="preserve">Mực-than nhanh chóng, matte</w:t>
             </w:r>
           </w:p>
         </w:tc>
@@ -6516,7 +6516,7 @@
                 <w:sz w:val="20"/>
                 <w:szCs w:val="20"/>
               </w:rPr>
-              <w:t xml:space="preserve">Directly replaces SDET-075 bamboo</w:t>
+              <w:t xml:space="preserve">Trực tiếp thay thế rèm tre SDET-075</w:t>
             </w:r>
           </w:p>
         </w:tc>
@@ -6547,7 +6547,7 @@
                 <w:sz w:val="20"/>
                 <w:szCs w:val="20"/>
               </w:rPr>
-              <w:t xml:space="preserve">Veranda ceiling</w:t>
+              <w:t xml:space="preserve">Trần hành lang có mái</w:t>
             </w:r>
           </w:p>
         </w:tc>
@@ -6576,7 +6576,7 @@
                 <w:sz w:val="20"/>
                 <w:szCs w:val="20"/>
               </w:rPr>
-              <w:t xml:space="preserve">Tongue-and-groove teak</w:t>
+              <w:t xml:space="preserve">Lưỡi teak-and-groove</w:t>
             </w:r>
           </w:p>
         </w:tc>
@@ -6605,7 +6605,7 @@
                 <w:sz w:val="20"/>
                 <w:szCs w:val="20"/>
               </w:rPr>
-              <w:t xml:space="preserve">Natural oil</w:t>
+              <w:t xml:space="preserve">Dầu tự nhiên</w:t>
             </w:r>
           </w:p>
         </w:tc>
@@ -6634,7 +6634,7 @@
                 <w:sz w:val="20"/>
                 <w:szCs w:val="20"/>
               </w:rPr>
-              <w:t xml:space="preserve">Softens overhang in photographs</w:t>
+              <w:t xml:space="preserve">Làm mềm quá hang trong ảnh</w:t>
             </w:r>
           </w:p>
         </w:tc>
@@ -6664,7 +6664,7 @@
                 <w:sz w:val="20"/>
                 <w:szCs w:val="20"/>
               </w:rPr>
-              <w:t xml:space="preserve">Glazing</w:t>
+              <w:t xml:space="preserve">Kính</w:t>
             </w:r>
           </w:p>
         </w:tc>
@@ -6692,7 +6692,7 @@
                 <w:sz w:val="20"/>
                 <w:szCs w:val="20"/>
               </w:rPr>
-              <w:t xml:space="preserve">Retained AD-series, bronze frames</w:t>
+              <w:t xml:space="preserve">Chuỗi AD được giữ lại, khung đồng</w:t>
             </w:r>
           </w:p>
         </w:tc>
@@ -6720,7 +6720,7 @@
                 <w:sz w:val="20"/>
                 <w:szCs w:val="20"/>
               </w:rPr>
-              <w:t xml:space="preserve">Neutral solar tint 20%</w:t>
+              <w:t xml:space="preserve">Tint mặt trời trung lập 20%</w:t>
             </w:r>
           </w:p>
         </w:tc>
@@ -6748,7 +6748,7 @@
                 <w:sz w:val="20"/>
                 <w:szCs w:val="20"/>
               </w:rPr>
-              <w:t xml:space="preserve">No reflective coatings</w:t>
+              <w:t xml:space="preserve">Không lớp phủ phản xạ</w:t>
             </w:r>
           </w:p>
         </w:tc>
@@ -6779,7 +6779,7 @@
                 <w:sz w:val="20"/>
                 <w:szCs w:val="20"/>
               </w:rPr>
-              <w:t xml:space="preserve">Veranda floor</w:t>
+              <w:t xml:space="preserve">Sàn hành lang có mái</w:t>
             </w:r>
           </w:p>
         </w:tc>
@@ -6808,7 +6808,7 @@
                 <w:sz w:val="20"/>
                 <w:szCs w:val="20"/>
               </w:rPr>
-              <w:t xml:space="preserve">Reclaimed teak deck</w:t>
+              <w:t xml:space="preserve">Sàn teak cổ</w:t>
             </w:r>
           </w:p>
         </w:tc>
@@ -6837,7 +6837,7 @@
                 <w:sz w:val="20"/>
                 <w:szCs w:val="20"/>
               </w:rPr>
-              <w:t xml:space="preserve">Natural silver-grey weathering</w:t>
+              <w:t xml:space="preserve">Che phủ bạc tự nhiên</w:t>
             </w:r>
           </w:p>
         </w:tc>
@@ -6866,7 +6866,7 @@
                 <w:sz w:val="20"/>
                 <w:szCs w:val="20"/>
               </w:rPr>
-              <w:t xml:space="preserve">Timber reads as landscape</w:t>
+              <w:t xml:space="preserve">Timber đọc như cảnh quan</w:t>
             </w:r>
           </w:p>
         </w:tc>
@@ -6896,7 +6896,7 @@
                 <w:sz w:val="20"/>
                 <w:szCs w:val="20"/>
               </w:rPr>
-              <w:t xml:space="preserve">Pool edge</w:t>
+              <w:t xml:space="preserve">Cạnh hồ bơi</w:t>
             </w:r>
           </w:p>
         </w:tc>
@@ -6924,7 +6924,7 @@
                 <w:sz w:val="20"/>
                 <w:szCs w:val="20"/>
               </w:rPr>
-              <w:t xml:space="preserve">Tumbled Indonesian basalt</w:t>
+              <w:t xml:space="preserve">Basalt Indonesia lăn</w:t>
             </w:r>
           </w:p>
         </w:tc>
@@ -6952,7 +6952,7 @@
                 <w:sz w:val="20"/>
                 <w:szCs w:val="20"/>
               </w:rPr>
-              <w:t xml:space="preserve">Charcoal, honed</w:t>
+              <w:t xml:space="preserve">Than, mài</w:t>
             </w:r>
           </w:p>
         </w:tc>
@@ -6980,7 +6980,7 @@
                 <w:sz w:val="20"/>
                 <w:szCs w:val="20"/>
               </w:rPr>
-              <w:t xml:space="preserve">Matches base wall</w:t>
+              <w:t xml:space="preserve">Khớp với tường cơ sở</w:t>
             </w:r>
           </w:p>
         </w:tc>
@@ -7011,7 +7011,7 @@
                 <w:sz w:val="20"/>
                 <w:szCs w:val="20"/>
               </w:rPr>
-              <w:t xml:space="preserve">Paths &amp; motor court</w:t>
+              <w:t xml:space="preserve">Đường dẫn &amp; sân xe motor</w:t>
             </w:r>
           </w:p>
         </w:tc>
@@ -7040,7 +7040,7 @@
                 <w:sz w:val="20"/>
                 <w:szCs w:val="20"/>
               </w:rPr>
-              <w:t xml:space="preserve">Sawn basalt setts with grass joints</w:t>
+              <w:t xml:space="preserve">Basalt cắt với khớp cỏ</w:t>
             </w:r>
           </w:p>
         </w:tc>
@@ -7069,7 +7069,7 @@
                 <w:sz w:val="20"/>
                 <w:szCs w:val="20"/>
               </w:rPr>
-              <w:t xml:space="preserve">Charcoal + green</w:t>
+              <w:t xml:space="preserve">Than + xanh</w:t>
             </w:r>
           </w:p>
         </w:tc>
@@ -7098,7 +7098,7 @@
                 <w:sz w:val="20"/>
                 <w:szCs w:val="20"/>
               </w:rPr>
-              <w:t xml:space="preserve">Permeable paving</w:t>
+              <w:t xml:space="preserve">Lát cảnh quan thẩm thấu</w:t>
             </w:r>
           </w:p>
         </w:tc>
@@ -7126,7 +7126,7 @@
           <w:sz w:val="28"/>
           <w:szCs w:val="28"/>
         </w:rPr>
-        <w:t xml:space="preserve">7.2 Interior palette</w:t>
+        <w:t xml:space="preserve">7.2 Bảng màu nội thất</w:t>
       </w:r>
     </w:p>
     <w:tbl>
@@ -7174,7 +7174,7 @@
                 <w:sz w:val="20"/>
                 <w:szCs w:val="20"/>
               </w:rPr>
-              <w:t xml:space="preserve">Zone</w:t>
+              <w:t xml:space="preserve">Khu vực</w:t>
             </w:r>
           </w:p>
         </w:tc>
@@ -7203,7 +7203,7 @@
                 <w:sz w:val="20"/>
                 <w:szCs w:val="20"/>
               </w:rPr>
-              <w:t xml:space="preserve">Walls</w:t>
+              <w:t xml:space="preserve">Tường</w:t>
             </w:r>
           </w:p>
         </w:tc>
@@ -7232,7 +7232,7 @@
                 <w:sz w:val="20"/>
                 <w:szCs w:val="20"/>
               </w:rPr>
-              <w:t xml:space="preserve">Floor</w:t>
+              <w:t xml:space="preserve">Sàn</w:t>
             </w:r>
           </w:p>
         </w:tc>
@@ -7261,7 +7261,7 @@
                 <w:sz w:val="20"/>
                 <w:szCs w:val="20"/>
               </w:rPr>
-              <w:t xml:space="preserve">Ceiling</w:t>
+              <w:t xml:space="preserve">Trần</w:t>
             </w:r>
           </w:p>
         </w:tc>
@@ -7290,7 +7290,7 @@
                 <w:sz w:val="20"/>
                 <w:szCs w:val="20"/>
               </w:rPr>
-              <w:t xml:space="preserve">Feature</w:t>
+              <w:t xml:space="preserve">Tính năng</w:t>
             </w:r>
           </w:p>
         </w:tc>
@@ -7320,7 +7320,7 @@
                 <w:sz w:val="20"/>
                 <w:szCs w:val="20"/>
               </w:rPr>
-              <w:t xml:space="preserve">Entry foyer</w:t>
+              <w:t xml:space="preserve">Sảnh vào</w:t>
             </w:r>
           </w:p>
         </w:tc>
@@ -7348,7 +7348,7 @@
                 <w:sz w:val="20"/>
                 <w:szCs w:val="20"/>
               </w:rPr>
-              <w:t xml:space="preserve">Venetian-plaster ivory</w:t>
+              <w:t xml:space="preserve">Vữa Venezia ốm</w:t>
             </w:r>
           </w:p>
         </w:tc>
@@ -7376,7 +7376,7 @@
                 <w:sz w:val="20"/>
                 <w:szCs w:val="20"/>
               </w:rPr>
-              <w:t xml:space="preserve">Tumbled travertine</w:t>
+              <w:t xml:space="preserve">Travertine lăn</w:t>
             </w:r>
           </w:p>
         </w:tc>
@@ -7404,7 +7404,7 @@
                 <w:sz w:val="20"/>
                 <w:szCs w:val="20"/>
               </w:rPr>
-              <w:t xml:space="preserve">Coffered teak</w:t>
+              <w:t xml:space="preserve">Teak coffered</w:t>
             </w:r>
           </w:p>
         </w:tc>
@@ -7432,7 +7432,7 @@
                 <w:sz w:val="20"/>
                 <w:szCs w:val="20"/>
               </w:rPr>
-              <w:t xml:space="preserve">Aged-brass lantern, 1.6 m dia</w:t>
+              <w:t xml:space="preserve">Hộp đèn đồng cũ, 1,6 m dia</w:t>
             </w:r>
           </w:p>
         </w:tc>
@@ -7463,7 +7463,7 @@
                 <w:sz w:val="20"/>
                 <w:szCs w:val="20"/>
               </w:rPr>
-              <w:t xml:space="preserve">Formal living</w:t>
+              <w:t xml:space="preserve">Phòng khách chính thức</w:t>
             </w:r>
           </w:p>
         </w:tc>
@@ -7492,7 +7492,7 @@
                 <w:sz w:val="20"/>
                 <w:szCs w:val="20"/>
               </w:rPr>
-              <w:t xml:space="preserve">Rough-plaster ivory, dado rail</w:t>
+              <w:t xml:space="preserve">Ốm thô, ray dado</w:t>
             </w:r>
           </w:p>
         </w:tc>
@@ -7521,7 +7521,7 @@
                 <w:sz w:val="20"/>
                 <w:szCs w:val="20"/>
               </w:rPr>
-              <w:t xml:space="preserve">Herringbone teak</w:t>
+              <w:t xml:space="preserve">Ngói teak xương cá</w:t>
             </w:r>
           </w:p>
         </w:tc>
@@ -7550,7 +7550,7 @@
                 <w:sz w:val="20"/>
                 <w:szCs w:val="20"/>
               </w:rPr>
-              <w:t xml:space="preserve">Raffia-panel between teak joists</w:t>
+              <w:t xml:space="preserve">Bảng tấm raffia giữa xà teak</w:t>
             </w:r>
           </w:p>
         </w:tc>
@@ -7579,7 +7579,7 @@
                 <w:sz w:val="20"/>
                 <w:szCs w:val="20"/>
               </w:rPr>
-              <w:t xml:space="preserve">Linen sofas, oat; ink velvet armchairs</w:t>
+              <w:t xml:space="preserve">Sofa linen, lúa mì; ghế bành nhung mực</w:t>
             </w:r>
           </w:p>
         </w:tc>
@@ -7609,7 +7609,7 @@
                 <w:sz w:val="20"/>
                 <w:szCs w:val="20"/>
               </w:rPr>
-              <w:t xml:space="preserve">Formal dining</w:t>
+              <w:t xml:space="preserve">Phòng ăn chính thức</w:t>
             </w:r>
           </w:p>
         </w:tc>
@@ -7637,7 +7637,7 @@
                 <w:sz w:val="20"/>
                 <w:szCs w:val="20"/>
               </w:rPr>
-              <w:t xml:space="preserve">Ivory with teak wainscoting</w:t>
+              <w:t xml:space="preserve">Ốm với ốp teak</w:t>
             </w:r>
           </w:p>
         </w:tc>
@@ -7665,7 +7665,7 @@
                 <w:sz w:val="20"/>
                 <w:szCs w:val="20"/>
               </w:rPr>
-              <w:t xml:space="preserve">Herringbone teak</w:t>
+              <w:t xml:space="preserve">Ngói teak xương cá</w:t>
             </w:r>
           </w:p>
         </w:tc>
@@ -7721,7 +7721,7 @@
                 <w:sz w:val="20"/>
                 <w:szCs w:val="20"/>
               </w:rPr>
-              <w:t xml:space="preserve">10-seat teak table, rattan chairs</w:t>
+              <w:t xml:space="preserve">Bàn teak 10 chỗ, ghế mây</w:t>
             </w:r>
           </w:p>
         </w:tc>
@@ -7752,7 +7752,7 @@
                 <w:sz w:val="20"/>
                 <w:szCs w:val="20"/>
               </w:rPr>
-              <w:t xml:space="preserve">Kitchen (open)</w:t>
+              <w:t xml:space="preserve">Bếp (mở)</w:t>
             </w:r>
           </w:p>
         </w:tc>
@@ -7781,7 +7781,7 @@
                 <w:sz w:val="20"/>
                 <w:szCs w:val="20"/>
               </w:rPr>
-              <w:t xml:space="preserve">Ivory with marble splashback</w:t>
+              <w:t xml:space="preserve">Ốm với backsplash đá cẩm thạch</w:t>
             </w:r>
           </w:p>
         </w:tc>
@@ -7810,7 +7810,7 @@
                 <w:sz w:val="20"/>
                 <w:szCs w:val="20"/>
               </w:rPr>
-              <w:t xml:space="preserve">Tumbled travertine</w:t>
+              <w:t xml:space="preserve">Travertine lăn</w:t>
             </w:r>
           </w:p>
         </w:tc>
@@ -7839,7 +7839,7 @@
                 <w:sz w:val="20"/>
                 <w:szCs w:val="20"/>
               </w:rPr>
-              <w:t xml:space="preserve">Flush plaster</w:t>
+              <w:t xml:space="preserve">Vữa để sạch</w:t>
             </w:r>
           </w:p>
         </w:tc>
@@ -7868,7 +7868,7 @@
                 <w:sz w:val="20"/>
                 <w:szCs w:val="20"/>
               </w:rPr>
-              <w:t xml:space="preserve">Honed Carrara island, brass hardware</w:t>
+              <w:t xml:space="preserve">Hòn đảo Carrara mài, phần cứng đồng</w:t>
             </w:r>
           </w:p>
         </w:tc>
@@ -7898,7 +7898,7 @@
                 <w:sz w:val="20"/>
                 <w:szCs w:val="20"/>
               </w:rPr>
-              <w:t xml:space="preserve">Primary suite</w:t>
+              <w:t xml:space="preserve">Phòng ngủ chính</w:t>
             </w:r>
           </w:p>
         </w:tc>
@@ -7926,7 +7926,7 @@
                 <w:sz w:val="20"/>
                 <w:szCs w:val="20"/>
               </w:rPr>
-              <w:t xml:space="preserve">Warm ivory, textile headboard wall</w:t>
+              <w:t xml:space="preserve">Ốm ấm, tường đầu vải dệt</w:t>
             </w:r>
           </w:p>
         </w:tc>
@@ -7954,7 +7954,7 @@
                 <w:sz w:val="20"/>
                 <w:szCs w:val="20"/>
               </w:rPr>
-              <w:t xml:space="preserve">White oak</w:t>
+              <w:t xml:space="preserve">Sồi trắng</w:t>
             </w:r>
           </w:p>
         </w:tc>
@@ -7982,7 +7982,7 @@
                 <w:sz w:val="20"/>
                 <w:szCs w:val="20"/>
               </w:rPr>
-              <w:t xml:space="preserve">Flush plaster</w:t>
+              <w:t xml:space="preserve">Vữa để sạch</w:t>
             </w:r>
           </w:p>
         </w:tc>
@@ -8010,7 +8010,7 @@
                 <w:sz w:val="20"/>
                 <w:szCs w:val="20"/>
               </w:rPr>
-              <w:t xml:space="preserve">Teak four-poster, raffia pendant</w:t>
+              <w:t xml:space="preserve">Giường bốn cột teak, mặt dây chuyền raffia</w:t>
             </w:r>
           </w:p>
         </w:tc>
@@ -8041,7 +8041,7 @@
                 <w:sz w:val="20"/>
                 <w:szCs w:val="20"/>
               </w:rPr>
-              <w:t xml:space="preserve">Primary bath</w:t>
+              <w:t xml:space="preserve">Phòng tắm chính</w:t>
             </w:r>
           </w:p>
         </w:tc>
@@ -8070,7 +8070,7 @@
                 <w:sz w:val="20"/>
                 <w:szCs w:val="20"/>
               </w:rPr>
-              <w:t xml:space="preserve">Honed Carrara panels</w:t>
+              <w:t xml:space="preserve">Bảng điều khiển Carrara mài</w:t>
             </w:r>
           </w:p>
         </w:tc>
@@ -8099,7 +8099,7 @@
                 <w:sz w:val="20"/>
                 <w:szCs w:val="20"/>
               </w:rPr>
-              <w:t xml:space="preserve">Honed Carrara</w:t>
+              <w:t xml:space="preserve">Carrara mài</w:t>
             </w:r>
           </w:p>
         </w:tc>
@@ -8128,7 +8128,7 @@
                 <w:sz w:val="20"/>
                 <w:szCs w:val="20"/>
               </w:rPr>
-              <w:t xml:space="preserve">Flush plaster</w:t>
+              <w:t xml:space="preserve">Vữa để sạch</w:t>
             </w:r>
           </w:p>
         </w:tc>
@@ -8157,7 +8157,7 @@
                 <w:sz w:val="20"/>
                 <w:szCs w:val="20"/>
               </w:rPr>
-              <w:t xml:space="preserve">Freestanding brass tub, bay view</w:t>
+              <w:t xml:space="preserve">Bồn tắm đồng cũ độc lập, tầm nhìn vịnh</w:t>
             </w:r>
           </w:p>
         </w:tc>
@@ -8187,7 +8187,7 @@
                 <w:sz w:val="20"/>
                 <w:szCs w:val="20"/>
               </w:rPr>
-              <w:t xml:space="preserve">Guest suites (L1)</w:t>
+              <w:t xml:space="preserve">Phòng khách (L1)</w:t>
             </w:r>
           </w:p>
         </w:tc>
@@ -8215,7 +8215,7 @@
                 <w:sz w:val="20"/>
                 <w:szCs w:val="20"/>
               </w:rPr>
-              <w:t xml:space="preserve">Rough-plaster ivory</w:t>
+              <w:t xml:space="preserve">Ốm thô ốm</w:t>
             </w:r>
           </w:p>
         </w:tc>
@@ -8243,7 +8243,7 @@
                 <w:sz w:val="20"/>
                 <w:szCs w:val="20"/>
               </w:rPr>
-              <w:t xml:space="preserve">White oak</w:t>
+              <w:t xml:space="preserve">Sồi trắng</w:t>
             </w:r>
           </w:p>
         </w:tc>
@@ -8271,35 +8271,7 @@
                 <w:sz w:val="20"/>
                 <w:szCs w:val="20"/>
               </w:rPr>
-              <w:t xml:space="preserve">Flush plaster with exposed tie-beam</w:t>
-            </w:r>
-          </w:p>
-        </w:tc>
-        <w:tc>
-          <w:tcPr>
-            <w:tcW w:type="pct" w:w="22%"/>
-            <w:tcMar>
-              <w:top w:type="dxa" w:w="120"/>
-              <w:left w:type="dxa" w:w="160"/>
-              <w:bottom w:type="dxa" w:w="120"/>
-              <w:right w:type="dxa" w:w="160"/>
-            </w:tcMar>
-          </w:tcPr>
-          <w:p>
-            <w:pPr>
-              <w:spacing w:after="40"/>
-              <w:jc w:val="left"/>
-            </w:pPr>
-            <w:r>
-              <w:rPr>
-                <w:rFonts w:ascii="Calibri" w:cs="Calibri" w:eastAsia="Calibri" w:hAnsi="Calibri"/>
-                <w:b w:val="false"/>
-                <w:bCs w:val="false"/>
-                <w:color w:val="1F2937"/>
-                <w:sz w:val="20"/>
-                <w:szCs w:val="20"/>
-              </w:rPr>
-              <w:t xml:space="preserve">Shutter-framed bay view from bed</w:t>
+              <w:t xml:space="preserve">Vữa để sạch với thanh buộc tiếp xúc</w:t>
             </w:r>
           </w:p>
         </w:tc>
@@ -8330,7 +8302,7 @@
                 <w:sz w:val="20"/>
                 <w:szCs w:val="20"/>
               </w:rPr>
-              <w:t xml:space="preserve">Guest lounge (L1)</w:t>
+              <w:t xml:space="preserve">Phòng lounge khách (L1)</w:t>
             </w:r>
           </w:p>
         </w:tc>
@@ -8359,7 +8331,7 @@
                 <w:sz w:val="20"/>
                 <w:szCs w:val="20"/>
               </w:rPr>
-              <w:t xml:space="preserve">Half-panel teak, ivory above</w:t>
+              <w:t xml:space="preserve">Nửa bảng teak, ốm ở trên</w:t>
             </w:r>
           </w:p>
         </w:tc>
@@ -8388,7 +8360,7 @@
                 <w:sz w:val="20"/>
                 <w:szCs w:val="20"/>
               </w:rPr>
-              <w:t xml:space="preserve">Herringbone teak</w:t>
+              <w:t xml:space="preserve">Ngói teak xương cá</w:t>
             </w:r>
           </w:p>
         </w:tc>
@@ -8417,7 +8389,7 @@
                 <w:sz w:val="20"/>
                 <w:szCs w:val="20"/>
               </w:rPr>
-              <w:t xml:space="preserve">Coffered teak</w:t>
+              <w:t xml:space="preserve">Teak coffered</w:t>
             </w:r>
           </w:p>
         </w:tc>
@@ -8446,7 +8418,7 @@
                 <w:sz w:val="20"/>
                 <w:szCs w:val="20"/>
               </w:rPr>
-              <w:t xml:space="preserve">Reading lamp, library wall</w:t>
+              <w:t xml:space="preserve">Đèn đọc, tường thư viện</w:t>
             </w:r>
           </w:p>
         </w:tc>
@@ -8471,7 +8443,7 @@
           <w:sz w:val="36"/>
           <w:szCs w:val="36"/>
         </w:rPr>
-        <w:t xml:space="preserve">08 · Interior &amp; Landscape Narrative</w:t>
+        <w:t xml:space="preserve">08 · Tường thuật nội thất &amp; cảnh quan</w:t>
       </w:r>
     </w:p>
     <w:p>
@@ -8499,7 +8471,7 @@
           <w:sz w:val="28"/>
           <w:szCs w:val="28"/>
         </w:rPr>
-        <w:t xml:space="preserve">8.1 Arrival sequence</w:t>
+        <w:t xml:space="preserve">8.1 Chuỗi sự đến</w:t>
       </w:r>
     </w:p>
     <w:p>
@@ -8518,7 +8490,7 @@
           <w:sz w:val="22"/>
           <w:szCs w:val="22"/>
         </w:rPr>
-        <w:t xml:space="preserve">Guests enter from the north through a 4 m wide motor court of sawn basalt with grass joints, flanked by two mature frangipani in raised stone planters. The porte-cochère is a single stone-clad volume with a pair of solid teak doors (2.4 m high, recessed teak panelling, aged-brass pulls). Crossing the threshold, the foyer rises to a double-height space capped by a coffered teak ceiling and a 1.6 m aged-brass lantern; a central axial vista draws the eye through the living and dining rooms to the bay beyond. The arrival sequence is staged for photography — 12 m of compressed-to-released ceiling height, charcoal-to-ivory contrast, and a first sight of the bay framed by teak mullions.</w:t>
+        <w:t xml:space="preserve">Khách vào từ phía bắc thông qua một sân xe motor 4 m rộng của basalt cắt với khớp cỏ, bao quanh bởi hai frangipani trưởng thành trong các bố cục đá nâng cao. Porte-cochère là một thể tích được lót đá đơn với một cặp cửa teak rắn (cao 2,4 m, ốp tấm teak, kéo đồng cũ). Vượt qua ngưỡng, sảnh tăng đến một không gian cao gấp đôi được che bằng một trần teak coffered và một hộp đèn đồng cũ 1,6 m; một tầm nhìn trục trung tâm kéo mắt qua các phòng khách và phòng ăn đến vịnh phía bbeyond. Chuỗi sự đến được giai đoạn cho nhiếp ảnh — 12 m chiều cao trần từ nén đến giải phóng, độ tương phản than-đến-ốm, và tầm nhìn đầu tiên của vịnh được khung bởi cửa sổ teak.</w:t>
       </w:r>
     </w:p>
     <w:p>
@@ -8535,7 +8507,7 @@
           <w:sz w:val="28"/>
           <w:szCs w:val="28"/>
         </w:rPr>
-        <w:t xml:space="preserve">8.2 The bay room (formal living)</w:t>
+        <w:t xml:space="preserve">8.2 Phòng vịnh (phòng khách chính thức)</w:t>
       </w:r>
     </w:p>
     <w:p>
@@ -8554,7 +8526,7 @@
           <w:sz w:val="22"/>
           <w:szCs w:val="22"/>
         </w:rPr>
-        <w:t xml:space="preserve">The formal living room is oriented along the south elevation — 11 m wide, 6 m deep, 3.4 m ceiling. Four pairs of full-height sliding teak-and-glass doors open onto the veranda. The central seating group is two 3.2 m linen sofas in oat facing each other across a reclaimed-teak coffee table, bracketed by two ink-velvet armchairs. A paired fireplace wall of honed travertine sits opposite the bay (non-functional in climate terms, but giving the room an axial anchor). Raffia-panel ceiling between exposed teak joists; vintage Turkish rug in faded rust; two aged-brass pendant lanterns. At dusk, the shutters half-closed throw horizontal-striped shadows across the floor.</w:t>
+        <w:t xml:space="preserve">Phòng khách chính thức hướng dọc theo mặt đứng phía nam — 11 m rộng, sâu 6 m, trần 3,4 m. Bốn cặp cửa kính trượt toàn chiều cao teak mở ra hành lang có mái. Nhóm chỗ ngồi trung tâm là hai sofa linen 3,2 m ở lúa mì quay mặt nhau trên một bàn cà phê teak cổ, ngoặc bởi hai ghế bành nhung mực. Tường lò sưởi ghép travertine mài ngồi đối diện với vịnh (không hoạt động về khí hậu, nhưng cung cấp cho phòng một neo trục). Bảng tấm raffia trần giữa xà teak tiếp xúc; thảm Thổ Nhĩ Kỳ cũ trong rỉ sét phai; hai hộp đèn mặt dây chuyền đồng cũ. Vào lúc hoàng hôn, các cửa chớp nửa đóng ném bóng ngang qua sàn.</w:t>
       </w:r>
     </w:p>
     <w:p>
@@ -8571,7 +8543,7 @@
           <w:sz w:val="28"/>
           <w:szCs w:val="28"/>
         </w:rPr>
-        <w:t xml:space="preserve">8.3 Primary suite</w:t>
+        <w:t xml:space="preserve">8.3 Phòng ngủ chính</w:t>
       </w:r>
     </w:p>
     <w:p>
@@ -8590,7 +8562,7 @@
           <w:sz w:val="22"/>
           <w:szCs w:val="22"/>
         </w:rPr>
-        <w:t xml:space="preserve">The primary suite occupies the west end of the GF, with its own covered terrace stepping directly onto the pool deck. A teak four-poster bed faces south to the bay; the textile headboard wall is covered in handwoven raffia. A pair of pivoting teak shutters frames the bay view from bed. The bathroom is a single honed-Carrara volume: a freestanding aged-brass tub sits on the south wall under a 1.2 × 1.2 m pivot window, giving a bath-with-bay-view moment that reads in Instagram format. The dressing room is panelled in teak with aged-brass inlays.</w:t>
+        <w:t xml:space="preserve">Phòng ngủ chính chiếm đầu phía tây của tầng trệt, với sân hiên che phủ riêng của nó bước trực tiếp vào sân hồ bơi. Giường bốn cột teak quay mặt phía nam đến vịnh; tường đầu vải dệt được bao phủ trong raffia dệt tay. Một cặp cửa chớp teak quay tương tác khung tầm nhìn vịnh từ giường. Phòng tắm là một thể tích Carrara mài duy nhất: một bồn tắm đồng cũ độc lập ngồi trên tường phía nam dưới một cửa sổ quay 1,2 × 1,2 m, cung cấp một khoảnh khắc tắm-với-tầm nhìn-vịnh mà đọc ở định dạng Instagram. Phòng trang điểm được ốp teak với inlay đồng cũ.</w:t>
       </w:r>
     </w:p>
     <w:p>
@@ -8607,7 +8579,7 @@
           <w:sz w:val="28"/>
           <w:szCs w:val="28"/>
         </w:rPr>
-        <w:t xml:space="preserve">8.4 Landscape — the bay terrace</w:t>
+        <w:t xml:space="preserve">8.4 Cảnh quan — sân hồ bơi</w:t>
       </w:r>
     </w:p>
     <w:p>
@@ -8626,7 +8598,7 @@
           <w:sz w:val="22"/>
           <w:szCs w:val="22"/>
         </w:rPr>
-        <w:t xml:space="preserve">The existing pool is retained but re-edged in tumbled basalt and extended by 1.5 m south toward a freshly landscaped planting bed of heliconia, bird-of-paradise and tropical grasses. A detached sala pavilion (3.6 × 3.6 m, pitched clay-tile roof to match the main house, open on four sides, day bed + brass drinks cart) sits on the east lawn as a shaded outdoor living room. An outdoor kitchen with a wood-fired grill is tucked into the south-east corner of the house. Mature mango and sea-almond trees edge the west boundary, giving afternoon shade to the primary suite terrace and framing the bay view in long-tail.</w:t>
+        <w:t xml:space="preserve">Hồ bơi hiện có được giữ lại nhưng được chỉnh sửa cạnh trong basalt lăn và mở rộng 1,5 m phía nam thành một giường cây trồng mới được phát triển của heliconia, chim thiên đường và cỏ nhiệt đới. Một sân khấu phòng tách biệt (3,6 × 3,6 m, mái ngói đất nung heng phù hợp với ngôi nhà chính, mở cả bốn phía, giường ngày + xe đẩy nước ngọt đồng) ngồi trên thảo nguyên phía đông như một phòng khách ngoài trời bóng. Một bếp ngoài trời với một lò nướng đốt gỗ được nhét vào góc nam-đông của nhà. Cây xoài và cây Nhân Hòa trưởng thành cạnh ranh giới phía tây, cung cấp bóng chiều cho sân hiên phòng ngủ chính và khung tầm nhìn vịnh trong đuôi dài.</w:t>
       </w:r>
     </w:p>
     <w:p>
@@ -8648,7 +8620,7 @@
           <w:sz w:val="36"/>
           <w:szCs w:val="36"/>
         </w:rPr>
-        <w:t xml:space="preserve">09 · Compliance Checklist</w:t>
+        <w:t xml:space="preserve">09 · Danh mục tuân thủ pháp lý</w:t>
       </w:r>
     </w:p>
     <w:p>
@@ -8735,7 +8707,7 @@
                 <w:sz w:val="20"/>
                 <w:szCs w:val="20"/>
               </w:rPr>
-              <w:t xml:space="preserve">Requirement</w:t>
+              <w:t xml:space="preserve">Yêu cầu</w:t>
             </w:r>
           </w:p>
         </w:tc>
@@ -8764,7 +8736,7 @@
                 <w:sz w:val="20"/>
                 <w:szCs w:val="20"/>
               </w:rPr>
-              <w:t xml:space="preserve">Source</w:t>
+              <w:t xml:space="preserve">Nguồn</w:t>
             </w:r>
           </w:p>
         </w:tc>
@@ -8793,7 +8765,7 @@
                 <w:sz w:val="20"/>
                 <w:szCs w:val="20"/>
               </w:rPr>
-              <w:t xml:space="preserve">Status</w:t>
+              <w:t xml:space="preserve">Trạng thái</w:t>
             </w:r>
           </w:p>
         </w:tc>
@@ -8851,7 +8823,7 @@
                 <w:sz w:val="20"/>
                 <w:szCs w:val="20"/>
               </w:rPr>
-              <w:t xml:space="preserve">Number of floors ≤ 3 (F1.2)</w:t>
+              <w:t xml:space="preserve">Số tầng ≤ 3 (F1.2)</w:t>
             </w:r>
           </w:p>
         </w:tc>
@@ -8907,7 +8879,7 @@
                 <w:sz w:val="20"/>
                 <w:szCs w:val="20"/>
               </w:rPr>
-              <w:t xml:space="preserve">✓ GF + L1 only</w:t>
+              <w:t xml:space="preserve">✓ Chỉ tầng trệt + tầng 1</w:t>
             </w:r>
           </w:p>
         </w:tc>
@@ -8967,7 +8939,7 @@
                 <w:sz w:val="20"/>
                 <w:szCs w:val="20"/>
               </w:rPr>
-              <w:t xml:space="preserve">GFA within approved 1/500 envelope</w:t>
+              <w:t xml:space="preserve">GFA trong phong bì 1/500 đã được phê duyệt</w:t>
             </w:r>
           </w:p>
         </w:tc>
@@ -9025,7 +8997,7 @@
                 <w:sz w:val="20"/>
                 <w:szCs w:val="20"/>
               </w:rPr>
-              <w:t xml:space="preserve">✓ L1 matches GF outline; no plot extension</w:t>
+              <w:t xml:space="preserve">✓ L1 khớp với đường bao tầng trệt; không mở rộng thửa đất</w:t>
             </w:r>
           </w:p>
         </w:tc>
@@ -9083,7 +9055,7 @@
                 <w:sz w:val="20"/>
                 <w:szCs w:val="20"/>
               </w:rPr>
-              <w:t xml:space="preserve">Setbacks per 1/500</w:t>
+              <w:t xml:space="preserve">Khoảng lùi mỗi 1/500</w:t>
             </w:r>
           </w:p>
         </w:tc>
@@ -9139,7 +9111,7 @@
                 <w:sz w:val="20"/>
                 <w:szCs w:val="20"/>
               </w:rPr>
-              <w:t xml:space="preserve">✓ Existing Caye Sereno setbacks retained unchanged</w:t>
+              <w:t xml:space="preserve">✓ Khoảng lùi Caye Sereno hiện có được giữ nguyên</w:t>
             </w:r>
           </w:p>
         </w:tc>
@@ -9199,7 +9171,7 @@
                 <w:sz w:val="20"/>
                 <w:szCs w:val="20"/>
               </w:rPr>
-              <w:t xml:space="preserve">Ridge ≤ 9.0 m</w:t>
+              <w:t xml:space="preserve">Đỉnh ≤ 9,0 m</w:t>
             </w:r>
           </w:p>
         </w:tc>
@@ -9228,7 +9200,7 @@
                 <w:sz w:val="20"/>
                 <w:szCs w:val="20"/>
               </w:rPr>
-              <w:t xml:space="preserve">UNESCO buffer convention</w:t>
+              <w:t xml:space="preserve">Quy ước vùng đệm UNESCO</w:t>
             </w:r>
           </w:p>
         </w:tc>
@@ -9257,7 +9229,7 @@
                 <w:sz w:val="20"/>
                 <w:szCs w:val="20"/>
               </w:rPr>
-              <w:t xml:space="preserve">✓ Central ridge +9.00 m; eave +6.50 m</w:t>
+              <w:t xml:space="preserve">✓ Đỉnh trung tâm +9,00 m; mái hiên +6,50 m</w:t>
             </w:r>
           </w:p>
         </w:tc>
@@ -9315,7 +9287,7 @@
                 <w:sz w:val="20"/>
                 <w:szCs w:val="20"/>
               </w:rPr>
-              <w:t xml:space="preserve">Muted, non-reflective exterior palette</w:t>
+              <w:t xml:space="preserve">Bảng màu bên ngoài nhẹ, không phản xạ</w:t>
             </w:r>
           </w:p>
         </w:tc>
@@ -9343,7 +9315,7 @@
                 <w:sz w:val="20"/>
                 <w:szCs w:val="20"/>
               </w:rPr>
-              <w:t xml:space="preserve">UNESCO buffer convention</w:t>
+              <w:t xml:space="preserve">Quy ước vùng đệm UNESCO</w:t>
             </w:r>
           </w:p>
         </w:tc>
@@ -9371,7 +9343,7 @@
                 <w:sz w:val="20"/>
                 <w:szCs w:val="20"/>
               </w:rPr>
-              <w:t xml:space="preserve">✓ Terracotta + ivory + basalt + teak</w:t>
+              <w:t xml:space="preserve">✓ Đất nung + ốm + basalt + teak</w:t>
             </w:r>
           </w:p>
         </w:tc>
@@ -9431,7 +9403,7 @@
                 <w:sz w:val="20"/>
                 <w:szCs w:val="20"/>
               </w:rPr>
-              <w:t xml:space="preserve">No new land-use fee trigger</w:t>
+              <w:t xml:space="preserve">Không kích hoạt lệ phí sử dụng đất mới</w:t>
             </w:r>
           </w:p>
         </w:tc>
@@ -9460,7 +9432,7 @@
                 <w:sz w:val="20"/>
                 <w:szCs w:val="20"/>
               </w:rPr>
-              <w:t xml:space="preserve">§5 LU fee receipts on file</w:t>
+              <w:t xml:space="preserve">§5 Hóa đơn lệ phí lưu giữ trên tệp</w:t>
             </w:r>
           </w:p>
         </w:tc>
@@ -9489,7 +9461,7 @@
                 <w:sz w:val="20"/>
                 <w:szCs w:val="20"/>
               </w:rPr>
-              <w:t xml:space="preserve">✓ No plot change, no re-zoning</w:t>
+              <w:t xml:space="preserve">✓ Không thay đổi thửa đất, không phân vùng lại</w:t>
             </w:r>
           </w:p>
         </w:tc>
@@ -9547,7 +9519,7 @@
                 <w:sz w:val="20"/>
                 <w:szCs w:val="20"/>
               </w:rPr>
-              <w:t xml:space="preserve">Environmental commitment still satisfied</w:t>
+              <w:t xml:space="preserve">Cam kết môi trường vẫn được thỏa mãn</w:t>
             </w:r>
           </w:p>
         </w:tc>
@@ -9575,7 +9547,7 @@
                 <w:sz w:val="20"/>
                 <w:szCs w:val="20"/>
               </w:rPr>
-              <w:t xml:space="preserve">§14 CKBVMT accepted</w:t>
+              <w:t xml:space="preserve">§14 CKBVMT được chấp nhận</w:t>
             </w:r>
           </w:p>
         </w:tc>
@@ -9603,7 +9575,7 @@
                 <w:sz w:val="20"/>
                 <w:szCs w:val="20"/>
               </w:rPr>
-              <w:t xml:space="preserve">✓ Refurb + L1 extension within approved scope</w:t>
+              <w:t xml:space="preserve">✓ Tu sửa + mở rộng L1 trong phạm vi được phê duyệt</w:t>
             </w:r>
           </w:p>
         </w:tc>
@@ -9663,7 +9635,7 @@
                 <w:sz w:val="20"/>
                 <w:szCs w:val="20"/>
               </w:rPr>
-              <w:t xml:space="preserve">Building permit exemption preserved</w:t>
+              <w:t xml:space="preserve">Miễn giấy phép xây dựng được bảo tồn</w:t>
             </w:r>
           </w:p>
         </w:tc>
@@ -9721,7 +9693,7 @@
                 <w:sz w:val="20"/>
                 <w:szCs w:val="20"/>
               </w:rPr>
-              <w:t xml:space="preserve">✓ 1/500 approval still governs</w:t>
+              <w:t xml:space="preserve">✓ Phê duyệt 1/500 vẫn quản lý</w:t>
             </w:r>
           </w:p>
         </w:tc>
@@ -9779,7 +9751,7 @@
                 <w:sz w:val="20"/>
                 <w:szCs w:val="20"/>
               </w:rPr>
-              <w:t xml:space="preserve">LURC parcels unchanged</w:t>
+              <w:t xml:space="preserve">Parcels LURC không thay đổi</w:t>
             </w:r>
           </w:p>
         </w:tc>
@@ -9835,7 +9807,7 @@
                 <w:sz w:val="20"/>
                 <w:szCs w:val="20"/>
               </w:rPr>
-              <w:t xml:space="preserve">✓ No sub-division</w:t>
+              <w:t xml:space="preserve">✓ Không phân chia</w:t>
             </w:r>
           </w:p>
         </w:tc>
@@ -9895,7 +9867,7 @@
                 <w:sz w:val="20"/>
                 <w:szCs w:val="20"/>
               </w:rPr>
-              <w:t xml:space="preserve">JVA obligations neutral</w:t>
+              <w:t xml:space="preserve">Nghĩa vụ JVA trung lập</w:t>
             </w:r>
           </w:p>
         </w:tc>
@@ -9953,7 +9925,7 @@
                 <w:sz w:val="20"/>
                 <w:szCs w:val="20"/>
               </w:rPr>
-              <w:t xml:space="preserve">✓ Design deliverable is style-neutral</w:t>
+              <w:t xml:space="preserve">✓ Sản phẩm bàn giao là style-neutral</w:t>
             </w:r>
           </w:p>
         </w:tc>
@@ -9981,7 +9953,7 @@
           <w:sz w:val="28"/>
           <w:szCs w:val="28"/>
         </w:rPr>
-        <w:t xml:space="preserve">9.1 Open items for engineering coordination</w:t>
+        <w:t xml:space="preserve">9.1 Các mục mở cho phối hợp kỹ thuật</w:t>
       </w:r>
     </w:p>
     <w:p>
@@ -10000,7 +9972,7 @@
           <w:sz w:val="22"/>
           <w:szCs w:val="22"/>
         </w:rPr>
-        <w:t xml:space="preserve">Structural — confirm existing columns/beams can take the new L1 slab over the former roof terrace (likely; the existing structure was sized for a full L1 floor in the original Transform scheme).</w:t>
+        <w:t xml:space="preserve">Kết cấu — xác nhận các cột/dầm hiện có có thể chịu sàn L1 mới trên sân thượng mái cũ (có khả năng; cấu trúc hiện có được định kích thước cho sàn L1 đầy đủ trong kế hoạch Transform ban đầu).</w:t>
       </w:r>
     </w:p>
     <w:p>
@@ -10019,7 +9991,7 @@
           <w:sz w:val="22"/>
           <w:szCs w:val="22"/>
         </w:rPr>
-        <w:t xml:space="preserve">Structural — new pitched roof truss span ≤ 11.55 m (primary) / 14.35 m (dining wing); teak glulam feasible, steel backup acceptable.</w:t>
+        <w:t xml:space="preserve">Kết cấu — nhịp mái dầm heng mới ≤ 11,55 m (chính) / 14,35 m (cánh phòng ăn); teak glulam khả thi, lưng thép có thể chấp nhận được.</w:t>
       </w:r>
     </w:p>
     <w:p>
@@ -10038,7 +10010,7 @@
           <w:sz w:val="22"/>
           <w:szCs w:val="22"/>
         </w:rPr>
-        <w:t xml:space="preserve">MEP — cooling load grows ~33% with new L1 conditioned area; confirm existing chiller plant capacity or size an additional compressor.</w:t>
+        <w:t xml:space="preserve">MEP — tải làm lạnh tăng ~33% với diện tích L1 điều hòa mới; xác nhận dung lượng nhà máy máy lạnh hiện có hoặc định kích thước một máy nén bổ sung.</w:t>
       </w:r>
     </w:p>
     <w:p>
@@ -10057,7 +10029,7 @@
           <w:sz w:val="22"/>
           <w:szCs w:val="22"/>
         </w:rPr>
-        <w:t xml:space="preserve">Drainage — pitched roof increases rainwater volume; new copper gutters + downpipes + sub-surface soakaway in the side setbacks.</w:t>
+        <w:t xml:space="preserve">Thoát nước — mái heng tăng khối lượng nước mưa; máng đồng mới + ống thoát + soakaway bề mặt dưới lòng đất ở các khoảng lùi bên.</w:t>
       </w:r>
     </w:p>
     <w:p>
@@ -10076,7 +10048,7 @@
           <w:sz w:val="22"/>
           <w:szCs w:val="22"/>
         </w:rPr>
-        <w:t xml:space="preserve">Fire — two escape staircases required at ≤25 m travel distance; existing single stair to be supplemented with a secondary stair at the dining-wing east gable.</w:t>
+        <w:t xml:space="preserve">Hỏa hoạn — cần hai cầu thang thoát ở khoảng cách ≤25 m; cầu thang duy nhất hiện có được bổ sung bằng một cầu thang thứ cấp ở gable đông cánh phòng ăn.</w:t>
       </w:r>
     </w:p>
     <w:p>
@@ -10095,7 +10067,7 @@
           <w:sz w:val="22"/>
           <w:szCs w:val="22"/>
         </w:rPr>
-        <w:t xml:space="preserve">Acoustics — raffia ceiling panels specified as perforated backing board to maintain Rw ≥ 45 dB between guest suites.</w:t>
+        <w:t xml:space="preserve">Âm thanh — bảng tấm raffia trần được chỉ định dưới hậu bối thủng để duy trì Rw ≥ 45 dB giữa các phòng khách.</w:t>
       </w:r>
     </w:p>
     <w:p>
@@ -10117,7 +10089,7 @@
           <w:sz w:val="36"/>
           <w:szCs w:val="36"/>
         </w:rPr>
-        <w:t xml:space="preserve">10 · Deliverables Register</w:t>
+        <w:t xml:space="preserve">10 · Danh mục sản phẩm bàn giao</w:t>
       </w:r>
     </w:p>
     <w:p>
@@ -10147,7 +10119,7 @@
           <w:sz w:val="22"/>
           <w:szCs w:val="22"/>
         </w:rPr>
-        <w:t xml:space="preserve">This concept design is one of three co-produced deliverables. The full package is listed below for the Jen Tuan Chau team:</w:t>
+        <w:t xml:space="preserve">Thiết kế khái niệm này là một trong ba sản phẩm bàn giao do cộng tác sản xuất. Gói đầy đủ được liệt kê dưới đây cho nhóm Jen Tuan Chau:</w:t>
       </w:r>
     </w:p>
     <w:tbl>
@@ -10223,7 +10195,7 @@
                 <w:sz w:val="20"/>
                 <w:szCs w:val="20"/>
               </w:rPr>
-              <w:t xml:space="preserve">Deliverable</w:t>
+              <w:t xml:space="preserve">Sản phẩm bàn giao</w:t>
             </w:r>
           </w:p>
         </w:tc>
@@ -10252,7 +10224,7 @@
                 <w:sz w:val="20"/>
                 <w:szCs w:val="20"/>
               </w:rPr>
-              <w:t xml:space="preserve">Format</w:t>
+              <w:t xml:space="preserve">Định dạng</w:t>
             </w:r>
           </w:p>
         </w:tc>
@@ -10281,7 +10253,7 @@
                 <w:sz w:val="20"/>
                 <w:szCs w:val="20"/>
               </w:rPr>
-              <w:t xml:space="preserve">Audience</w:t>
+              <w:t xml:space="preserve">Đối tượng</w:t>
             </w:r>
           </w:p>
         </w:tc>
@@ -10339,7 +10311,7 @@
                 <w:sz w:val="20"/>
                 <w:szCs w:val="20"/>
               </w:rPr>
-              <w:t xml:space="preserve">Concept Design — this document</w:t>
+              <w:t xml:space="preserve">Thiết kế khái niệm — tài liệu này</w:t>
             </w:r>
           </w:p>
         </w:tc>
@@ -10395,7 +10367,7 @@
                 <w:sz w:val="20"/>
                 <w:szCs w:val="20"/>
               </w:rPr>
-              <w:t xml:space="preserve">Board, JVA partners, planning reviewer</w:t>
+              <w:t xml:space="preserve">Hội đồng, đối tác liên doanh, nhà phê bình kế hoạch</w:t>
             </w:r>
           </w:p>
         </w:tc>
@@ -10455,7 +10427,7 @@
                 <w:sz w:val="20"/>
                 <w:szCs w:val="20"/>
               </w:rPr>
-              <w:t xml:space="preserve">Visual package — interactive site/plan/elevation viewer</w:t>
+              <w:t xml:space="preserve">Gói trực quan — trình xem khu đất/mặt bằng/mặt đứng tương tác</w:t>
             </w:r>
           </w:p>
         </w:tc>
@@ -10513,7 +10485,7 @@
                 <w:sz w:val="20"/>
                 <w:szCs w:val="20"/>
               </w:rPr>
-              <w:t xml:space="preserve">Board, marketing, investor deck</w:t>
+              <w:t xml:space="preserve">Hội đồng, tiếp thị, bộ nhà đầu tư</w:t>
             </w:r>
           </w:p>
         </w:tc>
@@ -10571,7 +10543,7 @@
                 <w:sz w:val="20"/>
                 <w:szCs w:val="20"/>
               </w:rPr>
-              <w:t xml:space="preserve">External-render prompt pack</w:t>
+              <w:t xml:space="preserve">Gói lời nhắc kết xuất bên ngoài</w:t>
             </w:r>
           </w:p>
         </w:tc>
@@ -10627,7 +10599,7 @@
                 <w:sz w:val="20"/>
                 <w:szCs w:val="20"/>
               </w:rPr>
-              <w:t xml:space="preserve">Visualisation studio / Midjourney / Flux</w:t>
+              <w:t xml:space="preserve">Studio trực quan / Midjourney / Flux</w:t>
             </w:r>
           </w:p>
         </w:tc>
@@ -10655,7 +10627,7 @@
           <w:sz w:val="28"/>
           <w:szCs w:val="28"/>
         </w:rPr>
-        <w:t xml:space="preserve">10.1 Prompt pack — summary</w:t>
+        <w:t xml:space="preserve">10.1 Tóm tắt gói lời nhắc</w:t>
       </w:r>
     </w:p>
     <w:p>
@@ -10674,7 +10646,7 @@
           <w:sz w:val="22"/>
           <w:szCs w:val="22"/>
         </w:rPr>
-        <w:t xml:space="preserve">Hero exterior (south-west corner, golden hour, veranda lit from within, bay in background).</w:t>
+        <w:t xml:space="preserve">Ngoại thất anh hùng (góc nam-tây, giờ vàng, hành lang có mái sáng từ trong, vịnh ở phía sau).</w:t>
       </w:r>
     </w:p>
     <w:p>
@@ -10693,7 +10665,7 @@
           <w:sz w:val="22"/>
           <w:szCs w:val="22"/>
         </w:rPr>
-        <w:t xml:space="preserve">Arrival / porte-cochère at dusk (copper lanterns, frangipani, teak doors).</w:t>
+        <w:t xml:space="preserve">Sự đến / porte-cochère vào lúc hoàng hôn (đèn lồng đồng, frangipani, cửa teak).</w:t>
       </w:r>
     </w:p>
     <w:p>
@@ -10712,7 +10684,7 @@
           <w:sz w:val="22"/>
           <w:szCs w:val="22"/>
         </w:rPr>
-        <w:t xml:space="preserve">Formal living room — bay view through open shutters, linen sofa, raffia ceiling.</w:t>
+        <w:t xml:space="preserve">Phòng khách chính thức — tầm nhìn vịnh qua các cửa chớp mở, sofa linen, trần raffia.</w:t>
       </w:r>
     </w:p>
     <w:p>
@@ -10731,7 +10703,7 @@
           <w:sz w:val="22"/>
           <w:szCs w:val="22"/>
         </w:rPr>
-        <w:t xml:space="preserve">Primary suite — four-poster bed, shutter-framed bay view, warm morning light.</w:t>
+        <w:t xml:space="preserve">Phòng ngủ chính — giường bốn cột, tầm nhìn vịnh được khung bởi cửa chớp, ánh sáng buổi sáng ấm.</w:t>
       </w:r>
     </w:p>
     <w:p>
@@ -10750,7 +10722,7 @@
           <w:sz w:val="22"/>
           <w:szCs w:val="22"/>
         </w:rPr>
-        <w:t xml:space="preserve">Pool terrace — infinity edge to bay, sala pavilion mid-frame, planting foreground.</w:t>
+        <w:t xml:space="preserve">Sân hồ bơi — cạnh vô cực đến vịnh, sân khấu phòng giữa khung hình, cây trồng tiền cảnh.</w:t>
       </w:r>
     </w:p>
     <w:p>
@@ -10767,7 +10739,7 @@
           <w:sz w:val="28"/>
           <w:szCs w:val="28"/>
         </w:rPr>
-        <w:t xml:space="preserve">10.2 Next steps</w:t>
+        <w:t xml:space="preserve">10.2 Bước tiếp theo</w:t>
       </w:r>
     </w:p>
     <w:p>
@@ -10786,7 +10758,7 @@
           <w:sz w:val="22"/>
           <w:szCs w:val="22"/>
         </w:rPr>
-        <w:t xml:space="preserve">Client review of this concept package — 5 working days.</w:t>
+        <w:t xml:space="preserve">Khách hàng xem xét gói khái niệm này — 5 ngày làm việc.</w:t>
       </w:r>
     </w:p>
     <w:p>
@@ -10805,7 +10777,7 @@
           <w:sz w:val="22"/>
           <w:szCs w:val="22"/>
         </w:rPr>
-        <w:t xml:space="preserve">Structural feasibility sign-off on L1 slab over former roof terrace — 10 working days.</w:t>
+        <w:t xml:space="preserve">Ký phê duyệt khả thi kết cấu trên sàn L1 trên sân thượng mái cũ — 10 ngày làm việc.</w:t>
       </w:r>
     </w:p>
     <w:p>
@@ -10824,7 +10796,7 @@
           <w:sz w:val="22"/>
           <w:szCs w:val="22"/>
         </w:rPr>
-        <w:t xml:space="preserve">Schematic Design (SD) package authorisation — target 1 June 2026.</w:t>
+        <w:t xml:space="preserve">Ủy quyền gói thiết kế cơ sở (SD) — mục tiêu 1 tháng 6 năm 2026.</w:t>
       </w:r>
     </w:p>
     <w:p>
@@ -10843,7 +10815,7 @@
           <w:sz w:val="22"/>
           <w:szCs w:val="22"/>
         </w:rPr>
-        <w:t xml:space="preserve">Design Development (DD) including MEP, FF&amp;E, landscape — target 1 September 2026.</w:t>
+        <w:t xml:space="preserve">Thiết kế kỹ thuật (DD) bao gồm MEP, FF&amp;E, cảnh quan — mục tiêu 1 tháng 9 năm 2026.</w:t>
       </w:r>
     </w:p>
     <w:p>
@@ -10862,7 +10834,7 @@
           <w:sz w:val="22"/>
           <w:szCs w:val="22"/>
         </w:rPr>
-        <w:t xml:space="preserve">Tender and construction authority notice (no GPXD required per §13) — target Q4 2026.</w:t>
+        <w:t xml:space="preserve">Thông báo xây dựng dự toán và chính quyền (không cần GPXD mỗi §13) — mục tiêu Q4 2026.</w:t>
       </w:r>
     </w:p>
     <w:p>
@@ -10884,7 +10856,7 @@
           <w:sz w:val="36"/>
           <w:szCs w:val="36"/>
         </w:rPr>
-        <w:t xml:space="preserve">Appendix A · Capella Sentosa Manor Spec Transfer</w:t>
+        <w:t xml:space="preserve">Phụ lục A · Chuyển giao quy cách Capella Sentosa Manor</w:t>
       </w:r>
     </w:p>
     <w:p>
@@ -10970,7 +10942,7 @@
                 <w:sz w:val="20"/>
                 <w:szCs w:val="20"/>
               </w:rPr>
-              <w:t xml:space="preserve">Value</w:t>
+              <w:t xml:space="preserve">Giá trị</w:t>
             </w:r>
           </w:p>
         </w:tc>
@@ -10999,7 +10971,7 @@
                 <w:sz w:val="20"/>
                 <w:szCs w:val="20"/>
               </w:rPr>
-              <w:t xml:space="preserve">Jen Tuan Chau equivalent</w:t>
+              <w:t xml:space="preserve">Tương đương Jen Tuan Chau</w:t>
             </w:r>
           </w:p>
         </w:tc>
@@ -11029,7 +11001,7 @@
                 <w:sz w:val="20"/>
                 <w:szCs w:val="20"/>
               </w:rPr>
-              <w:t xml:space="preserve">Typology</w:t>
+              <w:t xml:space="preserve">Loại hình</w:t>
             </w:r>
           </w:p>
         </w:tc>
@@ -11057,7 +11029,7 @@
                 <w:sz w:val="20"/>
                 <w:szCs w:val="20"/>
               </w:rPr>
-              <w:t xml:space="preserve">3-bed colonial manor</w:t>
+              <w:t xml:space="preserve">Biệt thự thuộc địa 3 phòng ngủ</w:t>
             </w:r>
           </w:p>
         </w:tc>
@@ -11085,7 +11057,7 @@
                 <w:sz w:val="20"/>
                 <w:szCs w:val="20"/>
               </w:rPr>
-              <w:t xml:space="preserve">4-bed + study colonial manor</w:t>
+              <w:t xml:space="preserve">Biệt thự thuộc địa 4 phòng ngủ + phòng học</w:t>
             </w:r>
           </w:p>
         </w:tc>
@@ -11116,7 +11088,7 @@
                 <w:sz w:val="20"/>
                 <w:szCs w:val="20"/>
               </w:rPr>
-              <w:t xml:space="preserve">GFA (interior)</w:t>
+              <w:t xml:space="preserve">GFA (nội thất)</w:t>
             </w:r>
           </w:p>
         </w:tc>
@@ -11174,7 +11146,7 @@
                 <w:sz w:val="20"/>
                 <w:szCs w:val="20"/>
               </w:rPr>
-              <w:t xml:space="preserve">~600 m² (+38%, L1 full match)</w:t>
+              <w:t xml:space="preserve">~600 m² (+38%, full match L1)</w:t>
             </w:r>
           </w:p>
         </w:tc>
@@ -11204,7 +11176,7 @@
                 <w:sz w:val="20"/>
                 <w:szCs w:val="20"/>
               </w:rPr>
-              <w:t xml:space="preserve">Bedrooms</w:t>
+              <w:t xml:space="preserve">Phòng ngủ</w:t>
             </w:r>
           </w:p>
         </w:tc>
@@ -11260,7 +11232,7 @@
                 <w:sz w:val="20"/>
                 <w:szCs w:val="20"/>
               </w:rPr>
-              <w:t xml:space="preserve">4 en-suite (1 primary + 3 guest)</w:t>
+              <w:t xml:space="preserve">4 en-suite (1 chính + 3 khách)</w:t>
             </w:r>
           </w:p>
         </w:tc>
@@ -11291,7 +11263,7 @@
                 <w:sz w:val="20"/>
                 <w:szCs w:val="20"/>
               </w:rPr>
-              <w:t xml:space="preserve">Living areas</w:t>
+              <w:t xml:space="preserve">Khu vực sống</w:t>
             </w:r>
           </w:p>
         </w:tc>
@@ -11320,7 +11292,7 @@
                 <w:sz w:val="20"/>
                 <w:szCs w:val="20"/>
               </w:rPr>
-              <w:t xml:space="preserve">2 (formal + family)</w:t>
+              <w:t xml:space="preserve">2 (chính thức + gia đình)</w:t>
             </w:r>
           </w:p>
         </w:tc>
@@ -11349,7 +11321,7 @@
                 <w:sz w:val="20"/>
                 <w:szCs w:val="20"/>
               </w:rPr>
-              <w:t xml:space="preserve">2 (formal + family) + study</w:t>
+              <w:t xml:space="preserve">2 (chính thức + gia đình) + phòng học</w:t>
             </w:r>
           </w:p>
         </w:tc>
@@ -11379,7 +11351,7 @@
                 <w:sz w:val="20"/>
                 <w:szCs w:val="20"/>
               </w:rPr>
-              <w:t xml:space="preserve">Pool</w:t>
+              <w:t xml:space="preserve">Hồ bơi</w:t>
             </w:r>
           </w:p>
         </w:tc>
@@ -11407,7 +11379,7 @@
                 <w:sz w:val="20"/>
                 <w:szCs w:val="20"/>
               </w:rPr>
-              <w:t xml:space="preserve">Private pool</w:t>
+              <w:t xml:space="preserve">Hồ bơi tư nhân</w:t>
             </w:r>
           </w:p>
         </w:tc>
@@ -11435,7 +11407,7 @@
                 <w:sz w:val="20"/>
                 <w:szCs w:val="20"/>
               </w:rPr>
-              <w:t xml:space="preserve">Existing Caye Sereno pool, re-edged</w:t>
+              <w:t xml:space="preserve">Hồ bơi Caye Sereno hiện có, chỉnh sửa cạnh</w:t>
             </w:r>
           </w:p>
         </w:tc>
@@ -11466,7 +11438,7 @@
                 <w:sz w:val="20"/>
                 <w:szCs w:val="20"/>
               </w:rPr>
-              <w:t xml:space="preserve">Pavilion</w:t>
+              <w:t xml:space="preserve">Sân khấu</w:t>
             </w:r>
           </w:p>
         </w:tc>
@@ -11495,7 +11467,7 @@
                 <w:sz w:val="20"/>
                 <w:szCs w:val="20"/>
               </w:rPr>
-              <w:t xml:space="preserve">Outdoor sala</w:t>
+              <w:t xml:space="preserve">Phòng ngoài trời</w:t>
             </w:r>
           </w:p>
         </w:tc>
@@ -11524,7 +11496,7 @@
                 <w:sz w:val="20"/>
                 <w:szCs w:val="20"/>
               </w:rPr>
-              <w:t xml:space="preserve">Detached sala pavilion, east lawn</w:t>
+              <w:t xml:space="preserve">Sân khấu phòng tách biệt, thảo nguyên phía đông</w:t>
             </w:r>
           </w:p>
         </w:tc>
@@ -11554,7 +11526,7 @@
                 <w:sz w:val="20"/>
                 <w:szCs w:val="20"/>
               </w:rPr>
-              <w:t xml:space="preserve">Roof</w:t>
+              <w:t xml:space="preserve">Mái</w:t>
             </w:r>
           </w:p>
         </w:tc>
@@ -11582,7 +11554,7 @@
                 <w:sz w:val="20"/>
                 <w:szCs w:val="20"/>
               </w:rPr>
-              <w:t xml:space="preserve">Pitched clay tile, copper ridge</w:t>
+              <w:t xml:space="preserve">Mái ngói đất nung heng, đỉnh đồng</w:t>
             </w:r>
           </w:p>
         </w:tc>
@@ -11610,7 +11582,7 @@
                 <w:sz w:val="20"/>
                 <w:szCs w:val="20"/>
               </w:rPr>
-              <w:t xml:space="preserve">Pitched clay tile, copper ridge (25°)</w:t>
+              <w:t xml:space="preserve">Mái ngói đất nung heng, đỉnh đồng (25°)</w:t>
             </w:r>
           </w:p>
         </w:tc>
@@ -11641,7 +11613,7 @@
                 <w:sz w:val="20"/>
                 <w:szCs w:val="20"/>
               </w:rPr>
-              <w:t xml:space="preserve">Walls</w:t>
+              <w:t xml:space="preserve">Tường</w:t>
             </w:r>
           </w:p>
         </w:tc>
@@ -11670,7 +11642,7 @@
                 <w:sz w:val="20"/>
                 <w:szCs w:val="20"/>
               </w:rPr>
-              <w:t xml:space="preserve">White lime-wash render</w:t>
+              <w:t xml:space="preserve">Sơn vôi trang trí trắng</w:t>
             </w:r>
           </w:p>
         </w:tc>
@@ -11699,7 +11671,7 @@
                 <w:sz w:val="20"/>
                 <w:szCs w:val="20"/>
               </w:rPr>
-              <w:t xml:space="preserve">White lime-wash render (NCS S 1005-Y20R)</w:t>
+              <w:t xml:space="preserve">Sơn vôi trang trí trắng (NCS S 1005-Y20R)</w:t>
             </w:r>
           </w:p>
         </w:tc>
@@ -11729,7 +11701,7 @@
                 <w:sz w:val="20"/>
                 <w:szCs w:val="20"/>
               </w:rPr>
-              <w:t xml:space="preserve">Shutters</w:t>
+              <w:t xml:space="preserve">Cửa chớp</w:t>
             </w:r>
           </w:p>
         </w:tc>
@@ -11757,7 +11729,7 @@
                 <w:sz w:val="20"/>
                 <w:szCs w:val="20"/>
               </w:rPr>
-              <w:t xml:space="preserve">Dark teak louvered</w:t>
+              <w:t xml:space="preserve">Teak lam đen</w:t>
             </w:r>
           </w:p>
         </w:tc>
@@ -11785,7 +11757,7 @@
                 <w:sz w:val="20"/>
                 <w:szCs w:val="20"/>
               </w:rPr>
-              <w:t xml:space="preserve">FSC teak, ink-charcoal stain</w:t>
+              <w:t xml:space="preserve">Teak FSC, mực-than nhanh chóng</w:t>
             </w:r>
           </w:p>
         </w:tc>
@@ -11816,7 +11788,7 @@
                 <w:sz w:val="20"/>
                 <w:szCs w:val="20"/>
               </w:rPr>
-              <w:t xml:space="preserve">Interior signature</w:t>
+              <w:t xml:space="preserve">Chữ ký nội thất</w:t>
             </w:r>
           </w:p>
         </w:tc>
@@ -11845,7 +11817,7 @@
                 <w:sz w:val="20"/>
                 <w:szCs w:val="20"/>
               </w:rPr>
-              <w:t xml:space="preserve">Ivory + teak + brass + raffia</w:t>
+              <w:t xml:space="preserve">Ốm + teak + đồng + raffia</w:t>
             </w:r>
           </w:p>
         </w:tc>
@@ -11874,7 +11846,7 @@
                 <w:sz w:val="20"/>
                 <w:szCs w:val="20"/>
               </w:rPr>
-              <w:t xml:space="preserve">Ivory + teak + brass + raffia</w:t>
+              <w:t xml:space="preserve">Ốm + teak + đồng + raffia</w:t>
             </w:r>
           </w:p>
         </w:tc>
@@ -11904,7 +11876,7 @@
                 <w:sz w:val="20"/>
                 <w:szCs w:val="20"/>
               </w:rPr>
-              <w:t xml:space="preserve">Landscape</w:t>
+              <w:t xml:space="preserve">Cảnh quan</w:t>
             </w:r>
           </w:p>
         </w:tc>
@@ -11932,7 +11904,7 @@
                 <w:sz w:val="20"/>
                 <w:szCs w:val="20"/>
               </w:rPr>
-              <w:t xml:space="preserve">Frangipani, heliconia, palms, mature trees</w:t>
+              <w:t xml:space="preserve">Frangipani, heliconia, cọc, cây trưởng thành</w:t>
             </w:r>
           </w:p>
         </w:tc>
@@ -11960,7 +11932,7 @@
                 <w:sz w:val="20"/>
                 <w:szCs w:val="20"/>
               </w:rPr>
-              <w:t xml:space="preserve">Frangipani pair at entry; heliconia + bird-of-paradise at pool; mango + sea-almond at west boundary</w:t>
+              <w:t xml:space="preserve">Cặp frangipani ở sân vào; heliconia + chim thiên đường ở sân hồ bơi; xoài + cây Nhân Hòa ở ranh giới tây</w:t>
             </w:r>
           </w:p>
         </w:tc>
@@ -11985,7 +11957,7 @@
           <w:sz w:val="36"/>
           <w:szCs w:val="36"/>
         </w:rPr>
-        <w:t xml:space="preserve">Appendix B · Area &amp; Dimension Cross-Check</w:t>
+        <w:t xml:space="preserve">Phụ lục B · Kiểm tra chéo diện tích &amp; kích thước</w:t>
       </w:r>
     </w:p>
     <w:p>
@@ -12015,7 +11987,7 @@
           <w:sz w:val="22"/>
           <w:szCs w:val="22"/>
         </w:rPr>
-        <w:t xml:space="preserve">All dimensions below are taken directly from ArAD.pdf (Transform Architecture, 06/2015). Areas are carried forward to the Hero Villa scheme.</w:t>
+        <w:t xml:space="preserve">Tất cả các kích thước dưới đây được lấy trực tiếp từ ArAD.pdf (Transform Architecture, 06/2015). Diện tích được thực hiện đến kế hoạch Biệt thự Anh hùng.</w:t>
       </w:r>
     </w:p>
     <w:tbl>
@@ -12061,7 +12033,7 @@
                 <w:sz w:val="20"/>
                 <w:szCs w:val="20"/>
               </w:rPr>
-              <w:t xml:space="preserve">Zone</w:t>
+              <w:t xml:space="preserve">Khu vực</w:t>
             </w:r>
           </w:p>
         </w:tc>
@@ -12090,7 +12062,7 @@
                 <w:sz w:val="20"/>
                 <w:szCs w:val="20"/>
               </w:rPr>
-              <w:t xml:space="preserve">Dimensions (mm)</w:t>
+              <w:t xml:space="preserve">Kích thước (mm)</w:t>
             </w:r>
           </w:p>
         </w:tc>
@@ -12119,7 +12091,7 @@
                 <w:sz w:val="20"/>
                 <w:szCs w:val="20"/>
               </w:rPr>
-              <w:t xml:space="preserve">Area (m²)</w:t>
+              <w:t xml:space="preserve">Diện tích (m²)</w:t>
             </w:r>
           </w:p>
         </w:tc>
@@ -12149,7 +12121,7 @@
                 <w:sz w:val="20"/>
                 <w:szCs w:val="20"/>
               </w:rPr>
-              <w:t xml:space="preserve">GF main block (living/dining)</w:t>
+              <w:t xml:space="preserve">Khối chính tầng trệt (phòng khách/ăn)</w:t>
             </w:r>
           </w:p>
         </w:tc>
@@ -12177,7 +12149,7 @@
                 <w:sz w:val="20"/>
                 <w:szCs w:val="20"/>
               </w:rPr>
-              <w:t xml:space="preserve">13,200 × 11,550</w:t>
+              <w:t xml:space="preserve">13.200 × 11.550</w:t>
             </w:r>
           </w:p>
         </w:tc>
@@ -12205,7 +12177,7 @@
                 <w:sz w:val="20"/>
                 <w:szCs w:val="20"/>
               </w:rPr>
-              <w:t xml:space="preserve">152.46</w:t>
+              <w:t xml:space="preserve">152,46</w:t>
             </w:r>
           </w:p>
         </w:tc>
@@ -12236,7 +12208,7 @@
                 <w:sz w:val="20"/>
                 <w:szCs w:val="20"/>
               </w:rPr>
-              <w:t xml:space="preserve">GF dining wing projection</w:t>
+              <w:t xml:space="preserve">Hình chiếu cánh phòng ăn tầng trệt</w:t>
             </w:r>
           </w:p>
         </w:tc>
@@ -12265,7 +12237,7 @@
                 <w:sz w:val="20"/>
                 <w:szCs w:val="20"/>
               </w:rPr>
-              <w:t xml:space="preserve">14,350 × 9,600 + service fillet</w:t>
+              <w:t xml:space="preserve">14.350 × 9.600 + fillet dịch vụ</w:t>
             </w:r>
           </w:p>
         </w:tc>
@@ -12294,7 +12266,7 @@
                 <w:sz w:val="20"/>
                 <w:szCs w:val="20"/>
               </w:rPr>
-              <w:t xml:space="preserve">≈ 147.80</w:t>
+              <w:t xml:space="preserve">≈ 147,80</w:t>
             </w:r>
           </w:p>
         </w:tc>
@@ -12324,7 +12296,7 @@
                 <w:sz w:val="20"/>
                 <w:szCs w:val="20"/>
               </w:rPr>
-              <w:t xml:space="preserve">GF enclosed — TOTAL</w:t>
+              <w:t xml:space="preserve">GF kín — TỔNG CỘNG</w:t>
             </w:r>
           </w:p>
         </w:tc>
@@ -12411,7 +12383,7 @@
                 <w:sz w:val="20"/>
                 <w:szCs w:val="20"/>
               </w:rPr>
-              <w:t xml:space="preserve">L1 (existing, Suites 3 + 4 + baths)</w:t>
+              <w:t xml:space="preserve">L1 (hiện có, Phòng 3 + 4 + bảo vệ)</w:t>
             </w:r>
           </w:p>
         </w:tc>
@@ -12440,7 +12412,7 @@
                 <w:sz w:val="20"/>
                 <w:szCs w:val="20"/>
               </w:rPr>
-              <w:t xml:space="preserve">13,200 × 11,550 (partial)</w:t>
+              <w:t xml:space="preserve">13.200 × 11.550 (một phần)</w:t>
             </w:r>
           </w:p>
         </w:tc>
@@ -12499,7 +12471,7 @@
                 <w:sz w:val="20"/>
                 <w:szCs w:val="20"/>
               </w:rPr>
-              <w:t xml:space="preserve">L1 extension new (over former terrace)</w:t>
+              <w:t xml:space="preserve">Mở rộng L1 mới (trên sân thượng cũ)</w:t>
             </w:r>
           </w:p>
         </w:tc>
@@ -12527,7 +12499,7 @@
                 <w:sz w:val="20"/>
                 <w:szCs w:val="20"/>
               </w:rPr>
-              <w:t xml:space="preserve">14,350 × 9,600 + fillet</w:t>
+              <w:t xml:space="preserve">14.350 × 9.600 + fillet</w:t>
             </w:r>
           </w:p>
         </w:tc>
@@ -12586,7 +12558,7 @@
                 <w:sz w:val="20"/>
                 <w:szCs w:val="20"/>
               </w:rPr>
-              <w:t xml:space="preserve">L1 enclosed — TOTAL (proposed)</w:t>
+              <w:t xml:space="preserve">L1 kín — TỔNG CỘNG (đề xuất)</w:t>
             </w:r>
           </w:p>
         </w:tc>
@@ -12615,7 +12587,7 @@
                 <w:sz w:val="20"/>
                 <w:szCs w:val="20"/>
               </w:rPr>
-              <w:t xml:space="preserve">Full match to GF</w:t>
+              <w:t xml:space="preserve">Full match với tầng trệt</w:t>
             </w:r>
           </w:p>
         </w:tc>
@@ -12674,7 +12646,7 @@
                 <w:sz w:val="20"/>
                 <w:szCs w:val="20"/>
               </w:rPr>
-              <w:t xml:space="preserve">Grand Total GFA</w:t>
+              <w:t xml:space="preserve">GFA Tổng cộng</w:t>
             </w:r>
           </w:p>
         </w:tc>
@@ -12761,7 +12733,7 @@
                 <w:sz w:val="20"/>
                 <w:szCs w:val="20"/>
               </w:rPr>
-              <w:t xml:space="preserve">Covered veranda GF (south + west)</w:t>
+              <w:t xml:space="preserve">Hành lang có mái kín tầng trệt (nam + tây)</w:t>
             </w:r>
           </w:p>
         </w:tc>
@@ -12790,7 +12762,7 @@
                 <w:sz w:val="20"/>
                 <w:szCs w:val="20"/>
               </w:rPr>
-              <w:t xml:space="preserve">2.4 m × ~50 m</w:t>
+              <w:t xml:space="preserve">2,4 m × ~50 m</w:t>
             </w:r>
           </w:p>
         </w:tc>
@@ -12849,7 +12821,7 @@
                 <w:sz w:val="20"/>
                 <w:szCs w:val="20"/>
               </w:rPr>
-              <w:t xml:space="preserve">Covered veranda L1 (south)</w:t>
+              <w:t xml:space="preserve">Hành lang có mái kín L1 (nam)</w:t>
             </w:r>
           </w:p>
         </w:tc>
@@ -12877,7 +12849,7 @@
                 <w:sz w:val="20"/>
                 <w:szCs w:val="20"/>
               </w:rPr>
-              <w:t xml:space="preserve">2.4 m × ~38 m</w:t>
+              <w:t xml:space="preserve">2,4 m × ~38 m</w:t>
             </w:r>
           </w:p>
         </w:tc>
@@ -12936,7 +12908,7 @@
                 <w:sz w:val="20"/>
                 <w:szCs w:val="20"/>
               </w:rPr>
-              <w:t xml:space="preserve">Pool surface (retained, re-edged)</w:t>
+              <w:t xml:space="preserve">Bề mặt hồ bơi (giữ lại, chỉnh sửa cạnh)</w:t>
             </w:r>
           </w:p>
         </w:tc>
@@ -12965,7 +12937,7 @@
                 <w:sz w:val="20"/>
                 <w:szCs w:val="20"/>
               </w:rPr>
-              <w:t xml:space="preserve">existing + 1.5 m extension</w:t>
+              <w:t xml:space="preserve">hiện có + mở rộng 1,5 m</w:t>
             </w:r>
           </w:p>
         </w:tc>
@@ -13024,7 +12996,7 @@
                 <w:sz w:val="20"/>
                 <w:szCs w:val="20"/>
               </w:rPr>
-              <w:t xml:space="preserve">Pool deck + sala pavilion lawn</w:t>
+              <w:t xml:space="preserve">Sân hồ bơi + thảo nguyên sân khấu</w:t>
             </w:r>
           </w:p>
         </w:tc>
@@ -13110,7 +13082,7 @@
           <w:sz w:val="22"/>
           <w:szCs w:val="22"/>
         </w:rPr>
-        <w:t xml:space="preserve">The area calculation confirms the headline figure of ~600 m² total GFA, ≈38% larger than the Capella Sentosa Manor benchmark. Because the L1 is extended within the existing GF outline, the plot and 1/500 envelope are unchanged — no re-approval is required.</w:t>
+        <w:t xml:space="preserve">Tính toán diện tích xác nhận con số tóm tắt ~600 m² tổng GFA, khoảng 38% lớn hơn tiêu chuẩn Capella Sentosa Manor. Bởi vì L1 được mở rộng trong đường bao tầng trệt hiện có, thửa đất và phong bì 1/500 không thay đổi — không cần phê duyệt lại.</w:t>
       </w:r>
     </w:p>
     <w:sectPr>
@@ -13179,7 +13151,7 @@
         <w:sz w:val="16"/>
         <w:szCs w:val="16"/>
       </w:rPr>
-      <w:t xml:space="preserve">Page </w:t>
+      <w:t xml:space="preserve">Trang </w:t>
     </w:r>
     <w:r>
       <w:rPr>
@@ -13200,7 +13172,7 @@
         <w:sz w:val="16"/>
         <w:szCs w:val="16"/>
       </w:rPr>
-      <w:t xml:space="preserve"> of </w:t>
+      <w:t xml:space="preserve"> của </w:t>
     </w:r>
     <w:r>
       <w:rPr>
@@ -13221,7 +13193,7 @@
         <w:sz w:val="16"/>
         <w:szCs w:val="16"/>
       </w:rPr>
-      <w:t xml:space="preserve">  ·  Concept Design · April 2026</w:t>
+      <w:t xml:space="preserve">  ·  Thiết kế khái niệm · Tháng Tư 2026</w:t>
     </w:r>
   </w:p>
 </w:ftr>
@@ -13277,7 +13249,7 @@
         <w:sz w:val="16"/>
         <w:szCs w:val="16"/>
       </w:rPr>
-      <w:t xml:space="preserve">JEN TUAN CHAU · HERO VILLA CONCEPT</w:t>
+      <w:t xml:space="preserve">JEN TUAN CHAU · BIỆT THỰ CHỦ ĐẠO</w:t>
     </w:r>
   </w:p>
 </w:hdr>

</xml_diff>